<commit_message>
Uploaded pics, report and json
</commit_message>
<xml_diff>
--- a/final_project/performance_analysis.docx
+++ b/final_project/performance_analysis.docx
@@ -4,507 +4,3063 @@
   <w:body>
     <w:p>
       <w:pPr>
+        <w:spacing w:after="0"/>
         <w:jc w:val="center"/>
+        <w:rPr>
+          <w:rFonts w:ascii="Times New Roman" w:hAnsi="Times New Roman" w:cs="Times New Roman"/>
+          <w:sz w:val="36"/>
+          <w:szCs w:val="36"/>
+        </w:rPr>
       </w:pPr>
       <w:r>
         <w:rPr>
+          <w:rFonts w:ascii="Times New Roman" w:hAnsi="Times New Roman" w:cs="Times New Roman"/>
           <w:b/>
-          <w:sz w:val="32"/>
+          <w:sz w:val="36"/>
+          <w:szCs w:val="36"/>
         </w:rPr>
-        <w:t>Spark Performance Optimization Analysis</w:t>
+        <w:t>Performance Analysis - Tweet Sentiment Pipeline</w:t>
       </w:r>
     </w:p>
     <w:p>
       <w:pPr>
+        <w:spacing w:after="40"/>
         <w:jc w:val="center"/>
+        <w:rPr>
+          <w:rFonts w:ascii="Times New Roman" w:hAnsi="Times New Roman" w:cs="Times New Roman"/>
+          <w:i/>
+          <w:sz w:val="20"/>
+          <w:szCs w:val="20"/>
+        </w:rPr>
+      </w:pPr>
+    </w:p>
+    <w:p>
+      <w:pPr>
+        <w:spacing w:after="40"/>
+        <w:jc w:val="center"/>
+        <w:rPr>
+          <w:rFonts w:ascii="Times New Roman" w:hAnsi="Times New Roman" w:cs="Times New Roman"/>
+          <w:b/>
+          <w:bCs/>
+          <w:iCs/>
+          <w:sz w:val="24"/>
+          <w:szCs w:val="24"/>
+        </w:rPr>
       </w:pPr>
       <w:r>
         <w:rPr>
-          <w:i/>
-          <w:sz w:val="22"/>
-        </w:rPr>
-        <w:t>Tweet Sentiment Pipeline (Bronze → Silver → Gold → Application)</w:t>
-      </w:r>
-    </w:p>
-    <w:p>
-      <w:pPr>
-        <w:jc w:val="center"/>
-      </w:pPr>
-      <w:r>
-        <w:rPr>
-          <w:color w:val="555555"/>
-          <w:sz w:val="20"/>
+          <w:rFonts w:ascii="Times New Roman" w:hAnsi="Times New Roman" w:cs="Times New Roman"/>
+          <w:b/>
+          <w:bCs/>
+          <w:iCs/>
+          <w:sz w:val="24"/>
+          <w:szCs w:val="24"/>
         </w:rPr>
         <w:t>DSCC-402 Final Project</w:t>
       </w:r>
     </w:p>
     <w:p>
       <w:pPr>
-        <w:pStyle w:val="Heading2"/>
+        <w:spacing w:after="40"/>
+        <w:jc w:val="center"/>
+        <w:rPr>
+          <w:rFonts w:ascii="Times New Roman" w:hAnsi="Times New Roman" w:cs="Times New Roman"/>
+          <w:iCs/>
+          <w:sz w:val="24"/>
+          <w:szCs w:val="24"/>
+        </w:rPr>
       </w:pPr>
       <w:r>
         <w:rPr>
-          <w:color w:val="1F3A5F"/>
+          <w:rFonts w:ascii="Times New Roman" w:hAnsi="Times New Roman" w:cs="Times New Roman"/>
+          <w:iCs/>
+          <w:sz w:val="24"/>
+          <w:szCs w:val="24"/>
         </w:rPr>
-        <w:t>Pipeline Overview &amp; Methodology</w:t>
-      </w:r>
-    </w:p>
-    <w:p>
-      <w:r>
-        <w:t xml:space="preserve">The pipeline ingests ~50K JSON tweets via CloudFiles into tweets_bronze, extracts and explodes @mentions into tweets_silver using a Python regex UDF, applies a DistilBERT sentiment model via mlflow.pyfunc.spark_udf to produce tweets_gold, and aggregates per-mention metrics in the gold_tweet_aggregations materialized view. Performance was profiled in the Spark UI by inspecting the DAG, stage Summary Metrics (shuffle read/write, spill, task duration percentiles), and the Storage tab for Delta file sizes. The </w:t>
-      </w:r>
-      <w:r>
-        <w:t>four issues below were the largest contributors to wall-clock time and resource pressure, and each is paired with a concrete fix and expected impact.</w:t>
+        <w:t>Zubaer Chowdhury</w:t>
       </w:r>
     </w:p>
     <w:p>
       <w:pPr>
-        <w:pStyle w:val="Heading2"/>
+        <w:spacing w:after="40"/>
+        <w:jc w:val="center"/>
+        <w:rPr>
+          <w:rFonts w:ascii="Times New Roman" w:hAnsi="Times New Roman" w:cs="Times New Roman"/>
+          <w:sz w:val="28"/>
+          <w:szCs w:val="28"/>
+        </w:rPr>
+      </w:pPr>
+    </w:p>
+    <w:p>
+      <w:pPr>
+        <w:spacing w:line="360" w:lineRule="auto"/>
+        <w:rPr>
+          <w:rFonts w:ascii="Times New Roman" w:hAnsi="Times New Roman" w:cs="Times New Roman"/>
+          <w:b/>
+          <w:sz w:val="28"/>
+          <w:szCs w:val="28"/>
+        </w:rPr>
       </w:pPr>
       <w:r>
         <w:rPr>
-          <w:color w:val="1F3A5F"/>
+          <w:rFonts w:ascii="Times New Roman" w:hAnsi="Times New Roman" w:cs="Times New Roman"/>
+          <w:b/>
+          <w:sz w:val="28"/>
+          <w:szCs w:val="28"/>
         </w:rPr>
-        <w:t>1. Skew – groupBy(mention) in the Aggregation Layer</w:t>
-      </w:r>
-    </w:p>
-    <w:p>
-      <w:r>
-        <w:rPr>
-          <w:b/>
-        </w:rPr>
-        <w:t xml:space="preserve">Symptom: </w:t>
-      </w:r>
-      <w:r>
-        <w:t>In gold_tweet_aggregations.sql we GROUP BY mention. Twitter mention distributions follow a power-law: a handful of celebrity / brand handles (e.g. @youtube, @ddlovato) capture an outsized share of mentions, while the long tail has 1–2 tweets per handle. The Spark UI Stages view shows this as a max-task duration that is 10–20× the median, with one or two reducers still running long after the rest have finished, and elevated Shuffle Spill (Memory) on those straggler tasks.</w:t>
-      </w:r>
-    </w:p>
-    <w:p>
-      <w:r>
-        <w:rPr>
-          <w:b/>
-        </w:rPr>
-        <w:t xml:space="preserve">Recommended strategies: </w:t>
-      </w:r>
-      <w:r>
-        <w:t>(1) Enable Adaptive Query Execution skew handling, which will split skewed shuffle partitions automatically:</w:t>
+        <w:t>Overview</w:t>
       </w:r>
     </w:p>
     <w:p>
       <w:pPr>
-        <w:pStyle w:val="ListBullet"/>
+        <w:spacing w:after="0"/>
+        <w:ind w:firstLine="720"/>
+        <w:rPr>
+          <w:rFonts w:ascii="Times New Roman" w:hAnsi="Times New Roman" w:cs="Times New Roman"/>
+          <w:sz w:val="24"/>
+          <w:szCs w:val="24"/>
+        </w:rPr>
       </w:pPr>
       <w:r>
-        <w:t>spark.sql.adaptive.enabled = true</w:t>
+        <w:rPr>
+          <w:rFonts w:ascii="Times New Roman" w:hAnsi="Times New Roman" w:cs="Times New Roman"/>
+          <w:sz w:val="24"/>
+          <w:szCs w:val="24"/>
+        </w:rPr>
+        <w:t>The pipeline follows a medallion flow</w:t>
+      </w:r>
+      <w:r>
+        <w:rPr>
+          <w:rFonts w:ascii="Times New Roman" w:hAnsi="Times New Roman" w:cs="Times New Roman"/>
+          <w:sz w:val="24"/>
+          <w:szCs w:val="24"/>
+        </w:rPr>
+        <w:t xml:space="preserve"> with </w:t>
+      </w:r>
+      <w:r>
+        <w:rPr>
+          <w:rFonts w:ascii="Times New Roman" w:hAnsi="Times New Roman" w:cs="Times New Roman"/>
+          <w:sz w:val="24"/>
+          <w:szCs w:val="24"/>
+        </w:rPr>
+        <w:t>raw JSON tweets</w:t>
+      </w:r>
+      <w:r>
+        <w:rPr>
+          <w:rFonts w:ascii="Times New Roman" w:hAnsi="Times New Roman" w:cs="Times New Roman"/>
+          <w:sz w:val="24"/>
+          <w:szCs w:val="24"/>
+        </w:rPr>
+        <w:t xml:space="preserve"> ingested into </w:t>
+      </w:r>
+      <w:proofErr w:type="gramStart"/>
+      <w:r>
+        <w:rPr>
+          <w:rFonts w:ascii="Times New Roman" w:hAnsi="Times New Roman" w:cs="Times New Roman"/>
+          <w:sz w:val="24"/>
+          <w:szCs w:val="24"/>
+        </w:rPr>
+        <w:t>Bronze</w:t>
+      </w:r>
+      <w:proofErr w:type="gramEnd"/>
+      <w:r>
+        <w:rPr>
+          <w:rFonts w:ascii="Times New Roman" w:hAnsi="Times New Roman" w:cs="Times New Roman"/>
+          <w:i/>
+          <w:iCs/>
+          <w:sz w:val="24"/>
+          <w:szCs w:val="24"/>
+        </w:rPr>
+        <w:t xml:space="preserve"> </w:t>
+      </w:r>
+      <w:r>
+        <w:rPr>
+          <w:rFonts w:ascii="Times New Roman" w:hAnsi="Times New Roman" w:cs="Times New Roman"/>
+          <w:sz w:val="24"/>
+          <w:szCs w:val="24"/>
+        </w:rPr>
+        <w:t>layer</w:t>
+      </w:r>
+      <w:r>
+        <w:rPr>
+          <w:rFonts w:ascii="Times New Roman" w:hAnsi="Times New Roman" w:cs="Times New Roman"/>
+          <w:sz w:val="24"/>
+          <w:szCs w:val="24"/>
+        </w:rPr>
+        <w:t>,</w:t>
+      </w:r>
+      <w:r>
+        <w:rPr>
+          <w:rFonts w:ascii="Times New Roman" w:hAnsi="Times New Roman" w:cs="Times New Roman"/>
+          <w:sz w:val="24"/>
+          <w:szCs w:val="24"/>
+        </w:rPr>
+        <w:t xml:space="preserve"> </w:t>
+      </w:r>
+      <w:r>
+        <w:rPr>
+          <w:rFonts w:ascii="Times New Roman" w:hAnsi="Times New Roman" w:cs="Times New Roman"/>
+          <w:sz w:val="24"/>
+          <w:szCs w:val="24"/>
+        </w:rPr>
+        <w:t xml:space="preserve">mentions are cleaned and exploded in </w:t>
+      </w:r>
+      <w:proofErr w:type="gramStart"/>
+      <w:r>
+        <w:rPr>
+          <w:rFonts w:ascii="Times New Roman" w:hAnsi="Times New Roman" w:cs="Times New Roman"/>
+          <w:sz w:val="24"/>
+          <w:szCs w:val="24"/>
+        </w:rPr>
+        <w:t>Silver</w:t>
+      </w:r>
+      <w:proofErr w:type="gramEnd"/>
+      <w:r>
+        <w:rPr>
+          <w:rFonts w:ascii="Times New Roman" w:hAnsi="Times New Roman" w:cs="Times New Roman"/>
+          <w:sz w:val="24"/>
+          <w:szCs w:val="24"/>
+        </w:rPr>
+        <w:t xml:space="preserve"> layer</w:t>
+      </w:r>
+      <w:r>
+        <w:rPr>
+          <w:rFonts w:ascii="Times New Roman" w:hAnsi="Times New Roman" w:cs="Times New Roman"/>
+          <w:sz w:val="24"/>
+          <w:szCs w:val="24"/>
+        </w:rPr>
+        <w:t xml:space="preserve">, </w:t>
+      </w:r>
+      <w:proofErr w:type="spellStart"/>
+      <w:r>
+        <w:rPr>
+          <w:rFonts w:ascii="Times New Roman" w:hAnsi="Times New Roman" w:cs="Times New Roman"/>
+          <w:sz w:val="24"/>
+          <w:szCs w:val="24"/>
+        </w:rPr>
+        <w:t>DistilBERT</w:t>
+      </w:r>
+      <w:proofErr w:type="spellEnd"/>
+      <w:r>
+        <w:rPr>
+          <w:rFonts w:ascii="Times New Roman" w:hAnsi="Times New Roman" w:cs="Times New Roman"/>
+          <w:sz w:val="24"/>
+          <w:szCs w:val="24"/>
+        </w:rPr>
+        <w:t xml:space="preserve"> sentiment inference applied in </w:t>
+      </w:r>
+      <w:proofErr w:type="gramStart"/>
+      <w:r>
+        <w:rPr>
+          <w:rFonts w:ascii="Times New Roman" w:hAnsi="Times New Roman" w:cs="Times New Roman"/>
+          <w:sz w:val="24"/>
+          <w:szCs w:val="24"/>
+        </w:rPr>
+        <w:t>Gold</w:t>
+      </w:r>
+      <w:proofErr w:type="gramEnd"/>
+      <w:r>
+        <w:rPr>
+          <w:rFonts w:ascii="Times New Roman" w:hAnsi="Times New Roman" w:cs="Times New Roman"/>
+          <w:sz w:val="24"/>
+          <w:szCs w:val="24"/>
+        </w:rPr>
+        <w:t xml:space="preserve"> layer</w:t>
+      </w:r>
+      <w:r>
+        <w:rPr>
+          <w:rFonts w:ascii="Times New Roman" w:hAnsi="Times New Roman" w:cs="Times New Roman"/>
+          <w:sz w:val="24"/>
+          <w:szCs w:val="24"/>
+        </w:rPr>
+        <w:t xml:space="preserve">, and per-mention metrics are served through the </w:t>
+      </w:r>
+      <w:proofErr w:type="gramStart"/>
+      <w:r>
+        <w:rPr>
+          <w:rFonts w:ascii="Times New Roman" w:hAnsi="Times New Roman" w:cs="Times New Roman"/>
+          <w:sz w:val="24"/>
+          <w:szCs w:val="24"/>
+        </w:rPr>
+        <w:t>Gold</w:t>
+      </w:r>
+      <w:proofErr w:type="gramEnd"/>
+      <w:r>
+        <w:rPr>
+          <w:rFonts w:ascii="Times New Roman" w:hAnsi="Times New Roman" w:cs="Times New Roman"/>
+          <w:sz w:val="24"/>
+          <w:szCs w:val="24"/>
+        </w:rPr>
+        <w:t xml:space="preserve"> layer </w:t>
+      </w:r>
+      <w:r>
+        <w:rPr>
+          <w:rFonts w:ascii="Times New Roman" w:hAnsi="Times New Roman" w:cs="Times New Roman"/>
+          <w:sz w:val="24"/>
+          <w:szCs w:val="24"/>
+        </w:rPr>
+        <w:t xml:space="preserve">aggregation </w:t>
+      </w:r>
+      <w:r>
+        <w:rPr>
+          <w:rFonts w:ascii="Times New Roman" w:hAnsi="Times New Roman" w:cs="Times New Roman"/>
+          <w:sz w:val="24"/>
+          <w:szCs w:val="24"/>
+        </w:rPr>
+        <w:t xml:space="preserve">materialized </w:t>
+      </w:r>
+      <w:r>
+        <w:rPr>
+          <w:rFonts w:ascii="Times New Roman" w:hAnsi="Times New Roman" w:cs="Times New Roman"/>
+          <w:sz w:val="24"/>
+          <w:szCs w:val="24"/>
+        </w:rPr>
+        <w:t xml:space="preserve">application </w:t>
+      </w:r>
+      <w:r>
+        <w:rPr>
+          <w:rFonts w:ascii="Times New Roman" w:hAnsi="Times New Roman" w:cs="Times New Roman"/>
+          <w:sz w:val="24"/>
+          <w:szCs w:val="24"/>
+        </w:rPr>
+        <w:t xml:space="preserve">view. </w:t>
+      </w:r>
+      <w:r>
+        <w:rPr>
+          <w:rFonts w:ascii="Times New Roman" w:hAnsi="Times New Roman" w:cs="Times New Roman"/>
+          <w:sz w:val="24"/>
+          <w:szCs w:val="24"/>
+        </w:rPr>
+        <w:t xml:space="preserve">The overview of the </w:t>
+      </w:r>
+      <w:r>
+        <w:rPr>
+          <w:rFonts w:ascii="Times New Roman" w:hAnsi="Times New Roman" w:cs="Times New Roman"/>
+          <w:sz w:val="24"/>
+          <w:szCs w:val="24"/>
+        </w:rPr>
+        <w:t>Databricks pipeline metrics</w:t>
+      </w:r>
+      <w:r>
+        <w:rPr>
+          <w:rFonts w:ascii="Times New Roman" w:hAnsi="Times New Roman" w:cs="Times New Roman"/>
+          <w:sz w:val="24"/>
+          <w:szCs w:val="24"/>
+        </w:rPr>
+        <w:t xml:space="preserve"> </w:t>
+      </w:r>
+      <w:proofErr w:type="gramStart"/>
+      <w:r>
+        <w:rPr>
+          <w:rFonts w:ascii="Times New Roman" w:hAnsi="Times New Roman" w:cs="Times New Roman"/>
+          <w:sz w:val="24"/>
+          <w:szCs w:val="24"/>
+        </w:rPr>
+        <w:t>are</w:t>
+      </w:r>
+      <w:proofErr w:type="gramEnd"/>
+      <w:r>
+        <w:rPr>
+          <w:rFonts w:ascii="Times New Roman" w:hAnsi="Times New Roman" w:cs="Times New Roman"/>
+          <w:sz w:val="24"/>
+          <w:szCs w:val="24"/>
+        </w:rPr>
+        <w:t xml:space="preserve"> given below:</w:t>
       </w:r>
     </w:p>
     <w:p>
       <w:pPr>
-        <w:pStyle w:val="ListBullet"/>
+        <w:spacing w:after="0"/>
+        <w:rPr>
+          <w:rFonts w:ascii="Times New Roman" w:hAnsi="Times New Roman" w:cs="Times New Roman"/>
+          <w:szCs w:val="16"/>
+        </w:rPr>
+      </w:pPr>
+    </w:p>
+    <w:p>
+      <w:pPr>
+        <w:spacing w:before="40"/>
+        <w:rPr>
+          <w:rFonts w:ascii="Times New Roman" w:hAnsi="Times New Roman" w:cs="Times New Roman"/>
+          <w:b/>
+          <w:sz w:val="24"/>
+          <w:szCs w:val="24"/>
+        </w:rPr>
       </w:pPr>
       <w:r>
-        <w:t>spark.sql.adaptive.skewJoin.enabled = true (covers groupBy spills via AQE coalesce + skew split)</w:t>
+        <w:rPr>
+          <w:rFonts w:ascii="Times New Roman" w:hAnsi="Times New Roman" w:cs="Times New Roman"/>
+          <w:b/>
+          <w:sz w:val="24"/>
+          <w:szCs w:val="24"/>
+        </w:rPr>
+        <w:t xml:space="preserve">Pipeline </w:t>
+      </w:r>
+      <w:r>
+        <w:rPr>
+          <w:rFonts w:ascii="Times New Roman" w:hAnsi="Times New Roman" w:cs="Times New Roman"/>
+          <w:b/>
+          <w:sz w:val="24"/>
+          <w:szCs w:val="24"/>
+        </w:rPr>
+        <w:t>Layer Performance Metrics</w:t>
       </w:r>
     </w:p>
     <w:p>
       <w:pPr>
-        <w:pStyle w:val="ListBullet"/>
+        <w:spacing w:before="40"/>
+        <w:rPr>
+          <w:rFonts w:ascii="Times New Roman" w:hAnsi="Times New Roman" w:cs="Times New Roman"/>
+          <w:szCs w:val="16"/>
+        </w:rPr>
+      </w:pPr>
+    </w:p>
+    <w:tbl>
+      <w:tblPr>
+        <w:tblStyle w:val="TableGrid"/>
+        <w:tblW w:w="0" w:type="auto"/>
+        <w:jc w:val="center"/>
+        <w:tblLook w:val="04A0" w:firstRow="1" w:lastRow="0" w:firstColumn="1" w:lastColumn="0" w:noHBand="0" w:noVBand="1"/>
+      </w:tblPr>
+      <w:tblGrid>
+        <w:gridCol w:w="1882"/>
+        <w:gridCol w:w="1345"/>
+        <w:gridCol w:w="657"/>
+        <w:gridCol w:w="2510"/>
+        <w:gridCol w:w="216"/>
+        <w:gridCol w:w="2956"/>
+        <w:gridCol w:w="10"/>
+      </w:tblGrid>
+      <w:tr>
+        <w:trPr>
+          <w:trHeight w:val="485"/>
+          <w:jc w:val="center"/>
+        </w:trPr>
+        <w:tc>
+          <w:tcPr>
+            <w:tcW w:w="1755" w:type="dxa"/>
+            <w:shd w:val="clear" w:color="auto" w:fill="D9EAF7"/>
+            <w:vAlign w:val="center"/>
+          </w:tcPr>
+          <w:p>
+            <w:pPr>
+              <w:jc w:val="center"/>
+              <w:rPr>
+                <w:rFonts w:ascii="Times New Roman" w:hAnsi="Times New Roman" w:cs="Times New Roman"/>
+                <w:sz w:val="24"/>
+                <w:szCs w:val="24"/>
+              </w:rPr>
+            </w:pPr>
+            <w:r>
+              <w:rPr>
+                <w:rFonts w:ascii="Times New Roman" w:hAnsi="Times New Roman" w:cs="Times New Roman"/>
+                <w:b/>
+                <w:sz w:val="24"/>
+                <w:szCs w:val="24"/>
+              </w:rPr>
+              <w:t>Layer</w:t>
+            </w:r>
+            <w:r>
+              <w:rPr>
+                <w:rFonts w:ascii="Times New Roman" w:hAnsi="Times New Roman" w:cs="Times New Roman"/>
+                <w:b/>
+                <w:sz w:val="24"/>
+                <w:szCs w:val="24"/>
+              </w:rPr>
+              <w:t>/Query</w:t>
+            </w:r>
+          </w:p>
+        </w:tc>
+        <w:tc>
+          <w:tcPr>
+            <w:tcW w:w="2015" w:type="dxa"/>
+            <w:gridSpan w:val="2"/>
+            <w:shd w:val="clear" w:color="auto" w:fill="D9EAF7"/>
+            <w:vAlign w:val="center"/>
+          </w:tcPr>
+          <w:p>
+            <w:pPr>
+              <w:jc w:val="center"/>
+              <w:rPr>
+                <w:rFonts w:ascii="Times New Roman" w:hAnsi="Times New Roman" w:cs="Times New Roman"/>
+                <w:sz w:val="24"/>
+                <w:szCs w:val="24"/>
+              </w:rPr>
+            </w:pPr>
+            <w:r>
+              <w:rPr>
+                <w:rFonts w:ascii="Times New Roman" w:hAnsi="Times New Roman" w:cs="Times New Roman"/>
+                <w:b/>
+                <w:sz w:val="24"/>
+                <w:szCs w:val="24"/>
+              </w:rPr>
+              <w:t>Measured runtime + rows</w:t>
+            </w:r>
+          </w:p>
+        </w:tc>
+        <w:tc>
+          <w:tcPr>
+            <w:tcW w:w="2758" w:type="dxa"/>
+            <w:gridSpan w:val="2"/>
+            <w:shd w:val="clear" w:color="auto" w:fill="D9EAF7"/>
+            <w:vAlign w:val="center"/>
+          </w:tcPr>
+          <w:p>
+            <w:pPr>
+              <w:jc w:val="center"/>
+              <w:rPr>
+                <w:rFonts w:ascii="Times New Roman" w:hAnsi="Times New Roman" w:cs="Times New Roman"/>
+                <w:sz w:val="24"/>
+                <w:szCs w:val="24"/>
+              </w:rPr>
+            </w:pPr>
+            <w:r>
+              <w:rPr>
+                <w:rFonts w:ascii="Times New Roman" w:hAnsi="Times New Roman" w:cs="Times New Roman"/>
+                <w:b/>
+                <w:sz w:val="24"/>
+                <w:szCs w:val="24"/>
+              </w:rPr>
+              <w:t xml:space="preserve">I/O and Spark </w:t>
+            </w:r>
+            <w:r>
+              <w:rPr>
+                <w:rFonts w:ascii="Times New Roman" w:hAnsi="Times New Roman" w:cs="Times New Roman"/>
+                <w:b/>
+                <w:sz w:val="24"/>
+                <w:szCs w:val="24"/>
+              </w:rPr>
+              <w:t>data</w:t>
+            </w:r>
+          </w:p>
+        </w:tc>
+        <w:tc>
+          <w:tcPr>
+            <w:tcW w:w="2940" w:type="dxa"/>
+            <w:gridSpan w:val="2"/>
+            <w:shd w:val="clear" w:color="auto" w:fill="D9EAF7"/>
+            <w:vAlign w:val="center"/>
+          </w:tcPr>
+          <w:p>
+            <w:pPr>
+              <w:jc w:val="center"/>
+              <w:rPr>
+                <w:rFonts w:ascii="Times New Roman" w:hAnsi="Times New Roman" w:cs="Times New Roman"/>
+                <w:sz w:val="24"/>
+                <w:szCs w:val="24"/>
+              </w:rPr>
+            </w:pPr>
+            <w:r>
+              <w:rPr>
+                <w:rFonts w:ascii="Times New Roman" w:hAnsi="Times New Roman" w:cs="Times New Roman"/>
+                <w:b/>
+                <w:sz w:val="24"/>
+                <w:szCs w:val="24"/>
+              </w:rPr>
+              <w:t xml:space="preserve">Performance </w:t>
+            </w:r>
+            <w:r>
+              <w:rPr>
+                <w:rFonts w:ascii="Times New Roman" w:hAnsi="Times New Roman" w:cs="Times New Roman"/>
+                <w:b/>
+                <w:sz w:val="24"/>
+                <w:szCs w:val="24"/>
+              </w:rPr>
+              <w:t>Comments</w:t>
+            </w:r>
+          </w:p>
+        </w:tc>
+      </w:tr>
+      <w:tr>
+        <w:trPr>
+          <w:jc w:val="center"/>
+        </w:trPr>
+        <w:tc>
+          <w:tcPr>
+            <w:tcW w:w="1755" w:type="dxa"/>
+            <w:vAlign w:val="center"/>
+          </w:tcPr>
+          <w:p>
+            <w:pPr>
+              <w:rPr>
+                <w:rFonts w:ascii="Times New Roman" w:hAnsi="Times New Roman" w:cs="Times New Roman"/>
+                <w:b/>
+                <w:bCs/>
+                <w:sz w:val="22"/>
+              </w:rPr>
+            </w:pPr>
+            <w:r>
+              <w:rPr>
+                <w:rFonts w:ascii="Times New Roman" w:hAnsi="Times New Roman" w:cs="Times New Roman"/>
+                <w:b/>
+                <w:bCs/>
+                <w:sz w:val="22"/>
+              </w:rPr>
+              <w:t>Bronze ingestion</w:t>
+            </w:r>
+          </w:p>
+        </w:tc>
+        <w:tc>
+          <w:tcPr>
+            <w:tcW w:w="2015" w:type="dxa"/>
+            <w:gridSpan w:val="2"/>
+            <w:vAlign w:val="center"/>
+          </w:tcPr>
+          <w:p>
+            <w:pPr>
+              <w:rPr>
+                <w:rFonts w:ascii="Times New Roman" w:hAnsi="Times New Roman" w:cs="Times New Roman"/>
+                <w:sz w:val="20"/>
+                <w:szCs w:val="20"/>
+              </w:rPr>
+            </w:pPr>
+            <w:r>
+              <w:rPr>
+                <w:rFonts w:ascii="Times New Roman" w:hAnsi="Times New Roman" w:cs="Times New Roman"/>
+                <w:sz w:val="20"/>
+                <w:szCs w:val="20"/>
+              </w:rPr>
+              <w:t>19.159 s detailed run</w:t>
+            </w:r>
+          </w:p>
+          <w:p>
+            <w:pPr>
+              <w:rPr>
+                <w:rFonts w:ascii="Times New Roman" w:hAnsi="Times New Roman" w:cs="Times New Roman"/>
+                <w:sz w:val="20"/>
+                <w:szCs w:val="20"/>
+              </w:rPr>
+            </w:pPr>
+            <w:r>
+              <w:rPr>
+                <w:rFonts w:ascii="Times New Roman" w:hAnsi="Times New Roman" w:cs="Times New Roman"/>
+                <w:sz w:val="20"/>
+                <w:szCs w:val="20"/>
+              </w:rPr>
+              <w:t>42,275 rows written</w:t>
+            </w:r>
+          </w:p>
+          <w:p>
+            <w:pPr>
+              <w:rPr>
+                <w:rFonts w:ascii="Times New Roman" w:hAnsi="Times New Roman" w:cs="Times New Roman"/>
+                <w:sz w:val="20"/>
+                <w:szCs w:val="20"/>
+              </w:rPr>
+            </w:pPr>
+            <w:r>
+              <w:rPr>
+                <w:rFonts w:ascii="Times New Roman" w:hAnsi="Times New Roman" w:cs="Times New Roman"/>
+                <w:sz w:val="20"/>
+                <w:szCs w:val="20"/>
+              </w:rPr>
+              <w:t>Stage list: 6.437 s.</w:t>
+            </w:r>
+          </w:p>
+        </w:tc>
+        <w:tc>
+          <w:tcPr>
+            <w:tcW w:w="2758" w:type="dxa"/>
+            <w:gridSpan w:val="2"/>
+            <w:vAlign w:val="center"/>
+          </w:tcPr>
+          <w:p>
+            <w:pPr>
+              <w:rPr>
+                <w:rFonts w:ascii="Times New Roman" w:hAnsi="Times New Roman" w:cs="Times New Roman"/>
+                <w:sz w:val="20"/>
+                <w:szCs w:val="20"/>
+              </w:rPr>
+            </w:pPr>
+            <w:r>
+              <w:rPr>
+                <w:rFonts w:ascii="Times New Roman" w:hAnsi="Times New Roman" w:cs="Times New Roman"/>
+                <w:sz w:val="20"/>
+                <w:szCs w:val="20"/>
+              </w:rPr>
+              <w:t>3.21 MB written</w:t>
+            </w:r>
+          </w:p>
+          <w:p>
+            <w:pPr>
+              <w:rPr>
+                <w:rFonts w:ascii="Times New Roman" w:hAnsi="Times New Roman" w:cs="Times New Roman"/>
+                <w:sz w:val="20"/>
+                <w:szCs w:val="20"/>
+              </w:rPr>
+            </w:pPr>
+            <w:r>
+              <w:rPr>
+                <w:rFonts w:ascii="Times New Roman" w:hAnsi="Times New Roman" w:cs="Times New Roman"/>
+                <w:sz w:val="20"/>
+                <w:szCs w:val="20"/>
+              </w:rPr>
+              <w:t>task time 36.75 s</w:t>
+            </w:r>
+          </w:p>
+          <w:p>
+            <w:pPr>
+              <w:rPr>
+                <w:rFonts w:ascii="Times New Roman" w:hAnsi="Times New Roman" w:cs="Times New Roman"/>
+                <w:sz w:val="20"/>
+                <w:szCs w:val="20"/>
+              </w:rPr>
+            </w:pPr>
+            <w:r>
+              <w:rPr>
+                <w:rFonts w:ascii="Times New Roman" w:hAnsi="Times New Roman" w:cs="Times New Roman"/>
+                <w:sz w:val="20"/>
+                <w:szCs w:val="20"/>
+              </w:rPr>
+              <w:t>Photon 1%; no spill shown.</w:t>
+            </w:r>
+          </w:p>
+        </w:tc>
+        <w:tc>
+          <w:tcPr>
+            <w:tcW w:w="2940" w:type="dxa"/>
+            <w:gridSpan w:val="2"/>
+            <w:vAlign w:val="center"/>
+          </w:tcPr>
+          <w:p>
+            <w:pPr>
+              <w:rPr>
+                <w:rFonts w:ascii="Times New Roman" w:hAnsi="Times New Roman" w:cs="Times New Roman"/>
+                <w:sz w:val="20"/>
+                <w:szCs w:val="20"/>
+              </w:rPr>
+            </w:pPr>
+            <w:r>
+              <w:rPr>
+                <w:rFonts w:ascii="Times New Roman" w:hAnsi="Times New Roman" w:cs="Times New Roman"/>
+                <w:sz w:val="20"/>
+                <w:szCs w:val="20"/>
+              </w:rPr>
+              <w:t>Mostly file ingestion/write overhead</w:t>
+            </w:r>
+            <w:r>
+              <w:rPr>
+                <w:rFonts w:ascii="Times New Roman" w:hAnsi="Times New Roman" w:cs="Times New Roman"/>
+                <w:sz w:val="20"/>
+                <w:szCs w:val="20"/>
+              </w:rPr>
+              <w:t>,</w:t>
+            </w:r>
+            <w:r>
+              <w:rPr>
+                <w:rFonts w:ascii="Times New Roman" w:hAnsi="Times New Roman" w:cs="Times New Roman"/>
+                <w:sz w:val="20"/>
+                <w:szCs w:val="20"/>
+              </w:rPr>
+              <w:t xml:space="preserve"> </w:t>
+            </w:r>
+            <w:r>
+              <w:rPr>
+                <w:rFonts w:ascii="Times New Roman" w:hAnsi="Times New Roman" w:cs="Times New Roman"/>
+                <w:sz w:val="20"/>
+                <w:szCs w:val="20"/>
+              </w:rPr>
+              <w:t>n</w:t>
+            </w:r>
+            <w:r>
+              <w:rPr>
+                <w:rFonts w:ascii="Times New Roman" w:hAnsi="Times New Roman" w:cs="Times New Roman"/>
+                <w:sz w:val="20"/>
+                <w:szCs w:val="20"/>
+              </w:rPr>
+              <w:t>ot the bottleneck</w:t>
+            </w:r>
+            <w:r>
+              <w:rPr>
+                <w:rFonts w:ascii="Times New Roman" w:hAnsi="Times New Roman" w:cs="Times New Roman"/>
+                <w:sz w:val="20"/>
+                <w:szCs w:val="20"/>
+              </w:rPr>
+              <w:t>.</w:t>
+            </w:r>
+            <w:r>
+              <w:rPr>
+                <w:rFonts w:ascii="Times New Roman" w:hAnsi="Times New Roman" w:cs="Times New Roman"/>
+                <w:sz w:val="20"/>
+                <w:szCs w:val="20"/>
+              </w:rPr>
+              <w:t xml:space="preserve"> </w:t>
+            </w:r>
+            <w:r>
+              <w:rPr>
+                <w:rFonts w:ascii="Times New Roman" w:hAnsi="Times New Roman" w:cs="Times New Roman"/>
+                <w:sz w:val="20"/>
+                <w:szCs w:val="20"/>
+              </w:rPr>
+              <w:t>K</w:t>
+            </w:r>
+            <w:r>
+              <w:rPr>
+                <w:rFonts w:ascii="Times New Roman" w:hAnsi="Times New Roman" w:cs="Times New Roman"/>
+                <w:sz w:val="20"/>
+                <w:szCs w:val="20"/>
+              </w:rPr>
+              <w:t>eep checkpointing stable and avoid unnecessary full refreshes.</w:t>
+            </w:r>
+          </w:p>
+        </w:tc>
+      </w:tr>
+      <w:tr>
+        <w:trPr>
+          <w:jc w:val="center"/>
+        </w:trPr>
+        <w:tc>
+          <w:tcPr>
+            <w:tcW w:w="1755" w:type="dxa"/>
+            <w:vAlign w:val="center"/>
+          </w:tcPr>
+          <w:p>
+            <w:pPr>
+              <w:rPr>
+                <w:rFonts w:ascii="Times New Roman" w:hAnsi="Times New Roman" w:cs="Times New Roman"/>
+                <w:b/>
+                <w:bCs/>
+                <w:sz w:val="22"/>
+              </w:rPr>
+            </w:pPr>
+            <w:r>
+              <w:rPr>
+                <w:rFonts w:ascii="Times New Roman" w:hAnsi="Times New Roman" w:cs="Times New Roman"/>
+                <w:b/>
+                <w:bCs/>
+                <w:sz w:val="22"/>
+              </w:rPr>
+              <w:t>Silver preprocessing</w:t>
+            </w:r>
+          </w:p>
+        </w:tc>
+        <w:tc>
+          <w:tcPr>
+            <w:tcW w:w="2015" w:type="dxa"/>
+            <w:gridSpan w:val="2"/>
+            <w:vAlign w:val="center"/>
+          </w:tcPr>
+          <w:p>
+            <w:pPr>
+              <w:rPr>
+                <w:rFonts w:ascii="Times New Roman" w:hAnsi="Times New Roman" w:cs="Times New Roman"/>
+                <w:sz w:val="20"/>
+                <w:szCs w:val="20"/>
+              </w:rPr>
+            </w:pPr>
+            <w:r>
+              <w:rPr>
+                <w:rFonts w:ascii="Times New Roman" w:hAnsi="Times New Roman" w:cs="Times New Roman"/>
+                <w:sz w:val="20"/>
+                <w:szCs w:val="20"/>
+              </w:rPr>
+              <w:t>4.050 s detailed run</w:t>
+            </w:r>
+          </w:p>
+          <w:p>
+            <w:pPr>
+              <w:rPr>
+                <w:rFonts w:ascii="Times New Roman" w:hAnsi="Times New Roman" w:cs="Times New Roman"/>
+                <w:sz w:val="20"/>
+                <w:szCs w:val="20"/>
+              </w:rPr>
+            </w:pPr>
+            <w:r>
+              <w:rPr>
+                <w:rFonts w:ascii="Times New Roman" w:hAnsi="Times New Roman" w:cs="Times New Roman"/>
+                <w:sz w:val="20"/>
+                <w:szCs w:val="20"/>
+              </w:rPr>
+              <w:t xml:space="preserve">42,276 read -&gt; 43,657 written. </w:t>
+            </w:r>
+          </w:p>
+          <w:p>
+            <w:pPr>
+              <w:rPr>
+                <w:rFonts w:ascii="Times New Roman" w:hAnsi="Times New Roman" w:cs="Times New Roman"/>
+                <w:sz w:val="20"/>
+                <w:szCs w:val="20"/>
+              </w:rPr>
+            </w:pPr>
+            <w:r>
+              <w:rPr>
+                <w:rFonts w:ascii="Times New Roman" w:hAnsi="Times New Roman" w:cs="Times New Roman"/>
+                <w:sz w:val="20"/>
+                <w:szCs w:val="20"/>
+              </w:rPr>
+              <w:t>Stage list: 3.175 s</w:t>
+            </w:r>
+          </w:p>
+        </w:tc>
+        <w:tc>
+          <w:tcPr>
+            <w:tcW w:w="2758" w:type="dxa"/>
+            <w:gridSpan w:val="2"/>
+            <w:vAlign w:val="center"/>
+          </w:tcPr>
+          <w:p>
+            <w:pPr>
+              <w:rPr>
+                <w:rFonts w:ascii="Times New Roman" w:hAnsi="Times New Roman" w:cs="Times New Roman"/>
+                <w:sz w:val="20"/>
+                <w:szCs w:val="20"/>
+              </w:rPr>
+            </w:pPr>
+            <w:r>
+              <w:rPr>
+                <w:rFonts w:ascii="Times New Roman" w:hAnsi="Times New Roman" w:cs="Times New Roman"/>
+                <w:sz w:val="20"/>
+                <w:szCs w:val="20"/>
+              </w:rPr>
+              <w:t>3.00 MB read, 5.02 MB written</w:t>
+            </w:r>
+          </w:p>
+          <w:p>
+            <w:pPr>
+              <w:rPr>
+                <w:rFonts w:ascii="Times New Roman" w:hAnsi="Times New Roman" w:cs="Times New Roman"/>
+                <w:sz w:val="20"/>
+                <w:szCs w:val="20"/>
+              </w:rPr>
+            </w:pPr>
+            <w:r>
+              <w:rPr>
+                <w:rFonts w:ascii="Times New Roman" w:hAnsi="Times New Roman" w:cs="Times New Roman"/>
+                <w:sz w:val="20"/>
+                <w:szCs w:val="20"/>
+              </w:rPr>
+              <w:t>Batch Eval Python operator</w:t>
+            </w:r>
+          </w:p>
+          <w:p>
+            <w:pPr>
+              <w:rPr>
+                <w:rFonts w:ascii="Times New Roman" w:hAnsi="Times New Roman" w:cs="Times New Roman"/>
+                <w:sz w:val="20"/>
+                <w:szCs w:val="20"/>
+              </w:rPr>
+            </w:pPr>
+            <w:r>
+              <w:rPr>
+                <w:rFonts w:ascii="Times New Roman" w:hAnsi="Times New Roman" w:cs="Times New Roman"/>
+                <w:sz w:val="20"/>
+                <w:szCs w:val="20"/>
+              </w:rPr>
+              <w:t>task time 1.97 s</w:t>
+            </w:r>
+          </w:p>
+          <w:p>
+            <w:pPr>
+              <w:rPr>
+                <w:rFonts w:ascii="Times New Roman" w:hAnsi="Times New Roman" w:cs="Times New Roman"/>
+                <w:sz w:val="20"/>
+                <w:szCs w:val="20"/>
+              </w:rPr>
+            </w:pPr>
+            <w:r>
+              <w:rPr>
+                <w:rFonts w:ascii="Times New Roman" w:hAnsi="Times New Roman" w:cs="Times New Roman"/>
+                <w:sz w:val="20"/>
+                <w:szCs w:val="20"/>
+              </w:rPr>
+              <w:t>Photon 21%; spill 0 bytes</w:t>
+            </w:r>
+          </w:p>
+        </w:tc>
+        <w:tc>
+          <w:tcPr>
+            <w:tcW w:w="2940" w:type="dxa"/>
+            <w:gridSpan w:val="2"/>
+            <w:vAlign w:val="center"/>
+          </w:tcPr>
+          <w:p>
+            <w:pPr>
+              <w:rPr>
+                <w:rFonts w:ascii="Times New Roman" w:hAnsi="Times New Roman" w:cs="Times New Roman"/>
+                <w:sz w:val="20"/>
+                <w:szCs w:val="20"/>
+              </w:rPr>
+            </w:pPr>
+            <w:r>
+              <w:rPr>
+                <w:rFonts w:ascii="Times New Roman" w:hAnsi="Times New Roman" w:cs="Times New Roman"/>
+                <w:sz w:val="20"/>
+                <w:szCs w:val="20"/>
+              </w:rPr>
+              <w:t>Regex UDF adds Python overhead, but current runtime is small. Replace Python UDF with native regex extraction to reduce serialization risk.</w:t>
+            </w:r>
+          </w:p>
+        </w:tc>
+      </w:tr>
+      <w:tr>
+        <w:trPr>
+          <w:jc w:val="center"/>
+        </w:trPr>
+        <w:tc>
+          <w:tcPr>
+            <w:tcW w:w="1755" w:type="dxa"/>
+            <w:vAlign w:val="center"/>
+          </w:tcPr>
+          <w:p>
+            <w:pPr>
+              <w:rPr>
+                <w:rFonts w:ascii="Times New Roman" w:hAnsi="Times New Roman" w:cs="Times New Roman"/>
+                <w:b/>
+                <w:bCs/>
+                <w:sz w:val="22"/>
+              </w:rPr>
+            </w:pPr>
+            <w:r>
+              <w:rPr>
+                <w:rFonts w:ascii="Times New Roman" w:hAnsi="Times New Roman" w:cs="Times New Roman"/>
+                <w:b/>
+                <w:bCs/>
+                <w:sz w:val="22"/>
+              </w:rPr>
+              <w:t>Gold ML inference</w:t>
+            </w:r>
+          </w:p>
+        </w:tc>
+        <w:tc>
+          <w:tcPr>
+            <w:tcW w:w="2015" w:type="dxa"/>
+            <w:gridSpan w:val="2"/>
+            <w:vAlign w:val="center"/>
+          </w:tcPr>
+          <w:p>
+            <w:pPr>
+              <w:rPr>
+                <w:rFonts w:ascii="Times New Roman" w:hAnsi="Times New Roman" w:cs="Times New Roman"/>
+                <w:sz w:val="20"/>
+                <w:szCs w:val="20"/>
+              </w:rPr>
+            </w:pPr>
+            <w:r>
+              <w:rPr>
+                <w:rFonts w:ascii="Times New Roman" w:hAnsi="Times New Roman" w:cs="Times New Roman"/>
+                <w:sz w:val="20"/>
+                <w:szCs w:val="20"/>
+              </w:rPr>
+              <w:t>1 h 1 m 47 s detailed run</w:t>
+            </w:r>
+          </w:p>
+          <w:p>
+            <w:pPr>
+              <w:rPr>
+                <w:rFonts w:ascii="Times New Roman" w:hAnsi="Times New Roman" w:cs="Times New Roman"/>
+                <w:sz w:val="20"/>
+                <w:szCs w:val="20"/>
+              </w:rPr>
+            </w:pPr>
+            <w:r>
+              <w:rPr>
+                <w:rFonts w:ascii="Times New Roman" w:hAnsi="Times New Roman" w:cs="Times New Roman"/>
+                <w:sz w:val="20"/>
+                <w:szCs w:val="20"/>
+              </w:rPr>
+              <w:t>43,658 read -&gt; 43,657 written</w:t>
+            </w:r>
+          </w:p>
+          <w:p>
+            <w:pPr>
+              <w:rPr>
+                <w:rFonts w:ascii="Times New Roman" w:hAnsi="Times New Roman" w:cs="Times New Roman"/>
+                <w:sz w:val="20"/>
+                <w:szCs w:val="20"/>
+              </w:rPr>
+            </w:pPr>
+            <w:r>
+              <w:rPr>
+                <w:rFonts w:ascii="Times New Roman" w:hAnsi="Times New Roman" w:cs="Times New Roman"/>
+                <w:sz w:val="20"/>
+                <w:szCs w:val="20"/>
+              </w:rPr>
+              <w:t>Stage list incremental run: 2.068 s.</w:t>
+            </w:r>
+          </w:p>
+        </w:tc>
+        <w:tc>
+          <w:tcPr>
+            <w:tcW w:w="2758" w:type="dxa"/>
+            <w:gridSpan w:val="2"/>
+            <w:vAlign w:val="center"/>
+          </w:tcPr>
+          <w:p>
+            <w:pPr>
+              <w:rPr>
+                <w:rFonts w:ascii="Times New Roman" w:hAnsi="Times New Roman" w:cs="Times New Roman"/>
+                <w:sz w:val="20"/>
+                <w:szCs w:val="20"/>
+              </w:rPr>
+            </w:pPr>
+            <w:r>
+              <w:rPr>
+                <w:rFonts w:ascii="Times New Roman" w:hAnsi="Times New Roman" w:cs="Times New Roman"/>
+                <w:sz w:val="20"/>
+                <w:szCs w:val="20"/>
+              </w:rPr>
+              <w:t>5.26 MB read, 5.28 MB written</w:t>
+            </w:r>
+          </w:p>
+          <w:p>
+            <w:pPr>
+              <w:rPr>
+                <w:rFonts w:ascii="Times New Roman" w:hAnsi="Times New Roman" w:cs="Times New Roman"/>
+                <w:sz w:val="20"/>
+                <w:szCs w:val="20"/>
+              </w:rPr>
+            </w:pPr>
+            <w:r>
+              <w:rPr>
+                <w:rFonts w:ascii="Times New Roman" w:hAnsi="Times New Roman" w:cs="Times New Roman"/>
+                <w:sz w:val="20"/>
+                <w:szCs w:val="20"/>
+              </w:rPr>
+              <w:t>Arrow Eval Python operator; task time 1.03 h Photon 0%</w:t>
+            </w:r>
+          </w:p>
+        </w:tc>
+        <w:tc>
+          <w:tcPr>
+            <w:tcW w:w="2940" w:type="dxa"/>
+            <w:gridSpan w:val="2"/>
+            <w:vAlign w:val="center"/>
+          </w:tcPr>
+          <w:p>
+            <w:pPr>
+              <w:rPr>
+                <w:rFonts w:ascii="Times New Roman" w:hAnsi="Times New Roman" w:cs="Times New Roman"/>
+                <w:sz w:val="20"/>
+                <w:szCs w:val="20"/>
+              </w:rPr>
+            </w:pPr>
+            <w:r>
+              <w:rPr>
+                <w:rFonts w:ascii="Times New Roman" w:hAnsi="Times New Roman" w:cs="Times New Roman"/>
+                <w:sz w:val="20"/>
+                <w:szCs w:val="20"/>
+              </w:rPr>
+              <w:t>Main bottleneck. Runtime is dominated by Python/transformer inference rather than data size or shuffle. Batch inference and cache/load model once per executor.</w:t>
+            </w:r>
+          </w:p>
+        </w:tc>
+      </w:tr>
+      <w:tr>
+        <w:trPr>
+          <w:jc w:val="center"/>
+        </w:trPr>
+        <w:tc>
+          <w:tcPr>
+            <w:tcW w:w="1755" w:type="dxa"/>
+            <w:vAlign w:val="center"/>
+          </w:tcPr>
+          <w:p>
+            <w:pPr>
+              <w:rPr>
+                <w:rFonts w:ascii="Times New Roman" w:hAnsi="Times New Roman" w:cs="Times New Roman"/>
+                <w:b/>
+                <w:bCs/>
+                <w:sz w:val="22"/>
+              </w:rPr>
+            </w:pPr>
+            <w:r>
+              <w:rPr>
+                <w:rFonts w:ascii="Times New Roman" w:hAnsi="Times New Roman" w:cs="Times New Roman"/>
+                <w:b/>
+                <w:bCs/>
+                <w:sz w:val="22"/>
+              </w:rPr>
+              <w:t>Application aggregation</w:t>
+            </w:r>
+          </w:p>
+        </w:tc>
+        <w:tc>
+          <w:tcPr>
+            <w:tcW w:w="2015" w:type="dxa"/>
+            <w:gridSpan w:val="2"/>
+            <w:vAlign w:val="center"/>
+          </w:tcPr>
+          <w:p>
+            <w:pPr>
+              <w:rPr>
+                <w:rFonts w:ascii="Times New Roman" w:hAnsi="Times New Roman" w:cs="Times New Roman"/>
+                <w:sz w:val="20"/>
+                <w:szCs w:val="20"/>
+              </w:rPr>
+            </w:pPr>
+            <w:r>
+              <w:rPr>
+                <w:rFonts w:ascii="Times New Roman" w:hAnsi="Times New Roman" w:cs="Times New Roman"/>
+                <w:sz w:val="20"/>
+                <w:szCs w:val="20"/>
+              </w:rPr>
+              <w:t>4.687 s detailed run</w:t>
+            </w:r>
+          </w:p>
+          <w:p>
+            <w:pPr>
+              <w:rPr>
+                <w:rFonts w:ascii="Times New Roman" w:hAnsi="Times New Roman" w:cs="Times New Roman"/>
+                <w:sz w:val="20"/>
+                <w:szCs w:val="20"/>
+              </w:rPr>
+            </w:pPr>
+            <w:r>
+              <w:rPr>
+                <w:rFonts w:ascii="Times New Roman" w:hAnsi="Times New Roman" w:cs="Times New Roman"/>
+                <w:sz w:val="20"/>
+                <w:szCs w:val="20"/>
+              </w:rPr>
+              <w:t xml:space="preserve">20,950 read -&gt; 17,985 written. </w:t>
+            </w:r>
+          </w:p>
+          <w:p>
+            <w:pPr>
+              <w:rPr>
+                <w:rFonts w:ascii="Times New Roman" w:hAnsi="Times New Roman" w:cs="Times New Roman"/>
+                <w:sz w:val="20"/>
+                <w:szCs w:val="20"/>
+              </w:rPr>
+            </w:pPr>
+            <w:r>
+              <w:rPr>
+                <w:rFonts w:ascii="Times New Roman" w:hAnsi="Times New Roman" w:cs="Times New Roman"/>
+                <w:sz w:val="20"/>
+                <w:szCs w:val="20"/>
+              </w:rPr>
+              <w:t>Stage list: 2.810 s.</w:t>
+            </w:r>
+          </w:p>
+        </w:tc>
+        <w:tc>
+          <w:tcPr>
+            <w:tcW w:w="2758" w:type="dxa"/>
+            <w:gridSpan w:val="2"/>
+            <w:vAlign w:val="center"/>
+          </w:tcPr>
+          <w:p>
+            <w:pPr>
+              <w:rPr>
+                <w:rFonts w:ascii="Times New Roman" w:hAnsi="Times New Roman" w:cs="Times New Roman"/>
+                <w:sz w:val="20"/>
+                <w:szCs w:val="20"/>
+              </w:rPr>
+            </w:pPr>
+            <w:r>
+              <w:rPr>
+                <w:rFonts w:ascii="Times New Roman" w:hAnsi="Times New Roman" w:cs="Times New Roman"/>
+                <w:sz w:val="20"/>
+                <w:szCs w:val="20"/>
+              </w:rPr>
+              <w:t xml:space="preserve">829.04 KB read, 496.89 KB </w:t>
+            </w:r>
+            <w:proofErr w:type="gramStart"/>
+            <w:r>
+              <w:rPr>
+                <w:rFonts w:ascii="Times New Roman" w:hAnsi="Times New Roman" w:cs="Times New Roman"/>
+                <w:sz w:val="20"/>
+                <w:szCs w:val="20"/>
+              </w:rPr>
+              <w:t>written;</w:t>
+            </w:r>
+            <w:proofErr w:type="gramEnd"/>
+            <w:r>
+              <w:rPr>
+                <w:rFonts w:ascii="Times New Roman" w:hAnsi="Times New Roman" w:cs="Times New Roman"/>
+                <w:sz w:val="20"/>
+                <w:szCs w:val="20"/>
+              </w:rPr>
+              <w:t xml:space="preserve"> Shuffle + Grouping Aggregate on mention</w:t>
+            </w:r>
+          </w:p>
+          <w:p>
+            <w:pPr>
+              <w:rPr>
+                <w:rFonts w:ascii="Times New Roman" w:hAnsi="Times New Roman" w:cs="Times New Roman"/>
+                <w:sz w:val="20"/>
+                <w:szCs w:val="20"/>
+              </w:rPr>
+            </w:pPr>
+            <w:r>
+              <w:rPr>
+                <w:rFonts w:ascii="Times New Roman" w:hAnsi="Times New Roman" w:cs="Times New Roman"/>
+                <w:sz w:val="20"/>
+                <w:szCs w:val="20"/>
+              </w:rPr>
+              <w:t>task time 1.05 s</w:t>
+            </w:r>
+          </w:p>
+          <w:p>
+            <w:pPr>
+              <w:rPr>
+                <w:rFonts w:ascii="Times New Roman" w:hAnsi="Times New Roman" w:cs="Times New Roman"/>
+                <w:sz w:val="20"/>
+                <w:szCs w:val="20"/>
+              </w:rPr>
+            </w:pPr>
+            <w:r>
+              <w:rPr>
+                <w:rFonts w:ascii="Times New Roman" w:hAnsi="Times New Roman" w:cs="Times New Roman"/>
+                <w:sz w:val="20"/>
+                <w:szCs w:val="20"/>
+              </w:rPr>
+              <w:t>Photon 82%; disk spill 0 bytes.</w:t>
+            </w:r>
+          </w:p>
+        </w:tc>
+        <w:tc>
+          <w:tcPr>
+            <w:tcW w:w="2940" w:type="dxa"/>
+            <w:gridSpan w:val="2"/>
+            <w:vAlign w:val="center"/>
+          </w:tcPr>
+          <w:p>
+            <w:pPr>
+              <w:rPr>
+                <w:rFonts w:ascii="Times New Roman" w:hAnsi="Times New Roman" w:cs="Times New Roman"/>
+                <w:sz w:val="20"/>
+                <w:szCs w:val="20"/>
+              </w:rPr>
+            </w:pPr>
+            <w:r>
+              <w:rPr>
+                <w:rFonts w:ascii="Times New Roman" w:hAnsi="Times New Roman" w:cs="Times New Roman"/>
+                <w:sz w:val="20"/>
+                <w:szCs w:val="20"/>
+              </w:rPr>
+              <w:t>Current aggregation is healthy</w:t>
+            </w:r>
+            <w:r>
+              <w:rPr>
+                <w:rFonts w:ascii="Times New Roman" w:hAnsi="Times New Roman" w:cs="Times New Roman"/>
+                <w:sz w:val="20"/>
+                <w:szCs w:val="20"/>
+              </w:rPr>
+              <w:t xml:space="preserve"> with</w:t>
+            </w:r>
+            <w:r>
+              <w:rPr>
+                <w:rFonts w:ascii="Times New Roman" w:hAnsi="Times New Roman" w:cs="Times New Roman"/>
+                <w:sz w:val="20"/>
+                <w:szCs w:val="20"/>
+              </w:rPr>
+              <w:t xml:space="preserve"> small data, no spill, and high Photon use. Keep watching skew as mentions grow.</w:t>
+            </w:r>
+          </w:p>
+        </w:tc>
+      </w:tr>
+      <w:tr>
+        <w:trPr>
+          <w:gridAfter w:val="1"/>
+          <w:wAfter w:w="15" w:type="dxa"/>
+          <w:trHeight w:val="62"/>
+          <w:jc w:val="center"/>
+        </w:trPr>
+        <w:tc>
+          <w:tcPr>
+            <w:tcW w:w="3129" w:type="dxa"/>
+            <w:gridSpan w:val="2"/>
+            <w:tcBorders>
+              <w:top w:val="nil"/>
+              <w:left w:val="nil"/>
+              <w:bottom w:val="nil"/>
+              <w:right w:val="nil"/>
+            </w:tcBorders>
+            <w:vAlign w:val="center"/>
+          </w:tcPr>
+          <w:p>
+            <w:pPr>
+              <w:jc w:val="center"/>
+              <w:rPr>
+                <w:rFonts w:ascii="Times New Roman" w:hAnsi="Times New Roman" w:cs="Times New Roman"/>
+                <w:sz w:val="20"/>
+                <w:szCs w:val="20"/>
+              </w:rPr>
+            </w:pPr>
+            <w:r>
+              <w:rPr>
+                <w:rFonts w:ascii="Times New Roman" w:hAnsi="Times New Roman" w:cs="Times New Roman"/>
+                <w:sz w:val="20"/>
+                <w:szCs w:val="20"/>
+              </w:rPr>
+              <w:br/>
+            </w:r>
+            <w:r>
+              <w:rPr>
+                <w:rFonts w:ascii="Times New Roman" w:hAnsi="Times New Roman" w:cs="Times New Roman"/>
+                <w:b/>
+                <w:noProof/>
+                <w:sz w:val="28"/>
+                <w:szCs w:val="28"/>
+              </w:rPr>
+              <w:drawing>
+                <wp:inline distT="0" distB="0" distL="0" distR="0" wp14:anchorId="2EC67914" wp14:editId="399974DE">
+                  <wp:extent cx="2082800" cy="2019605"/>
+                  <wp:effectExtent l="0" t="0" r="0" b="0"/>
+                  <wp:docPr id="39017934" name="Picture 3"/>
+                  <wp:cNvGraphicFramePr>
+                    <a:graphicFrameLocks xmlns:a="http://schemas.openxmlformats.org/drawingml/2006/main" noChangeAspect="1"/>
+                  </wp:cNvGraphicFramePr>
+                  <a:graphic xmlns:a="http://schemas.openxmlformats.org/drawingml/2006/main">
+                    <a:graphicData uri="http://schemas.openxmlformats.org/drawingml/2006/picture">
+                      <pic:pic xmlns:pic="http://schemas.openxmlformats.org/drawingml/2006/picture">
+                        <pic:nvPicPr>
+                          <pic:cNvPr id="0" name="Picture 3"/>
+                          <pic:cNvPicPr>
+                            <a:picLocks noChangeAspect="1" noChangeArrowheads="1"/>
+                          </pic:cNvPicPr>
+                        </pic:nvPicPr>
+                        <pic:blipFill>
+                          <a:blip r:embed="rId8">
+                            <a:extLst>
+                              <a:ext uri="{28A0092B-C50C-407E-A947-70E740481C1C}">
+                                <a14:useLocalDpi xmlns:a14="http://schemas.microsoft.com/office/drawing/2010/main" val="0"/>
+                              </a:ext>
+                            </a:extLst>
+                          </a:blip>
+                          <a:srcRect/>
+                          <a:stretch>
+                            <a:fillRect/>
+                          </a:stretch>
+                        </pic:blipFill>
+                        <pic:spPr bwMode="auto">
+                          <a:xfrm>
+                            <a:off x="0" y="0"/>
+                            <a:ext cx="2088104" cy="2024748"/>
+                          </a:xfrm>
+                          <a:prstGeom prst="rect">
+                            <a:avLst/>
+                          </a:prstGeom>
+                          <a:noFill/>
+                          <a:ln>
+                            <a:noFill/>
+                          </a:ln>
+                        </pic:spPr>
+                      </pic:pic>
+                    </a:graphicData>
+                  </a:graphic>
+                </wp:inline>
+              </w:drawing>
+            </w:r>
+          </w:p>
+        </w:tc>
+        <w:tc>
+          <w:tcPr>
+            <w:tcW w:w="3178" w:type="dxa"/>
+            <w:gridSpan w:val="2"/>
+            <w:tcBorders>
+              <w:top w:val="nil"/>
+              <w:left w:val="nil"/>
+              <w:bottom w:val="nil"/>
+              <w:right w:val="nil"/>
+            </w:tcBorders>
+            <w:vAlign w:val="center"/>
+          </w:tcPr>
+          <w:p>
+            <w:pPr>
+              <w:jc w:val="center"/>
+              <w:rPr>
+                <w:rFonts w:ascii="Times New Roman" w:hAnsi="Times New Roman" w:cs="Times New Roman"/>
+                <w:sz w:val="20"/>
+                <w:szCs w:val="20"/>
+              </w:rPr>
+            </w:pPr>
+            <w:r>
+              <w:rPr>
+                <w:rFonts w:ascii="Times New Roman" w:hAnsi="Times New Roman" w:cs="Times New Roman"/>
+                <w:sz w:val="20"/>
+                <w:szCs w:val="20"/>
+              </w:rPr>
+              <w:br/>
+            </w:r>
+            <w:r>
+              <w:rPr>
+                <w:noProof/>
+              </w:rPr>
+              <w:drawing>
+                <wp:inline distT="0" distB="0" distL="0" distR="0" wp14:anchorId="1B751084" wp14:editId="1F3C9F2E">
+                  <wp:extent cx="2041557" cy="2012950"/>
+                  <wp:effectExtent l="0" t="0" r="0" b="6350"/>
+                  <wp:docPr id="1702447863" name="Picture 4"/>
+                  <wp:cNvGraphicFramePr>
+                    <a:graphicFrameLocks xmlns:a="http://schemas.openxmlformats.org/drawingml/2006/main" noChangeAspect="1"/>
+                  </wp:cNvGraphicFramePr>
+                  <a:graphic xmlns:a="http://schemas.openxmlformats.org/drawingml/2006/main">
+                    <a:graphicData uri="http://schemas.openxmlformats.org/drawingml/2006/picture">
+                      <pic:pic xmlns:pic="http://schemas.openxmlformats.org/drawingml/2006/picture">
+                        <pic:nvPicPr>
+                          <pic:cNvPr id="0" name="Picture 4"/>
+                          <pic:cNvPicPr>
+                            <a:picLocks noChangeAspect="1" noChangeArrowheads="1"/>
+                          </pic:cNvPicPr>
+                        </pic:nvPicPr>
+                        <pic:blipFill>
+                          <a:blip r:embed="rId9">
+                            <a:extLst>
+                              <a:ext uri="{28A0092B-C50C-407E-A947-70E740481C1C}">
+                                <a14:useLocalDpi xmlns:a14="http://schemas.microsoft.com/office/drawing/2010/main" val="0"/>
+                              </a:ext>
+                            </a:extLst>
+                          </a:blip>
+                          <a:srcRect/>
+                          <a:stretch>
+                            <a:fillRect/>
+                          </a:stretch>
+                        </pic:blipFill>
+                        <pic:spPr bwMode="auto">
+                          <a:xfrm>
+                            <a:off x="0" y="0"/>
+                            <a:ext cx="2057686" cy="2028853"/>
+                          </a:xfrm>
+                          <a:prstGeom prst="rect">
+                            <a:avLst/>
+                          </a:prstGeom>
+                          <a:noFill/>
+                          <a:ln>
+                            <a:noFill/>
+                          </a:ln>
+                        </pic:spPr>
+                      </pic:pic>
+                    </a:graphicData>
+                  </a:graphic>
+                </wp:inline>
+              </w:drawing>
+            </w:r>
+          </w:p>
+        </w:tc>
+        <w:tc>
+          <w:tcPr>
+            <w:tcW w:w="3146" w:type="dxa"/>
+            <w:gridSpan w:val="2"/>
+            <w:tcBorders>
+              <w:top w:val="nil"/>
+              <w:left w:val="nil"/>
+              <w:bottom w:val="nil"/>
+              <w:right w:val="nil"/>
+            </w:tcBorders>
+            <w:vAlign w:val="center"/>
+          </w:tcPr>
+          <w:p>
+            <w:pPr>
+              <w:jc w:val="center"/>
+              <w:rPr>
+                <w:rFonts w:ascii="Times New Roman" w:hAnsi="Times New Roman" w:cs="Times New Roman"/>
+                <w:sz w:val="20"/>
+                <w:szCs w:val="20"/>
+              </w:rPr>
+            </w:pPr>
+            <w:r>
+              <w:rPr>
+                <w:noProof/>
+              </w:rPr>
+              <w:br/>
+            </w:r>
+            <w:r>
+              <w:rPr>
+                <w:noProof/>
+              </w:rPr>
+              <w:drawing>
+                <wp:inline distT="0" distB="0" distL="0" distR="0" wp14:anchorId="37CEE5BD" wp14:editId="351CF3EC">
+                  <wp:extent cx="2044700" cy="2010750"/>
+                  <wp:effectExtent l="0" t="0" r="0" b="8890"/>
+                  <wp:docPr id="1806178144" name="Picture 7"/>
+                  <wp:cNvGraphicFramePr>
+                    <a:graphicFrameLocks xmlns:a="http://schemas.openxmlformats.org/drawingml/2006/main" noChangeAspect="1"/>
+                  </wp:cNvGraphicFramePr>
+                  <a:graphic xmlns:a="http://schemas.openxmlformats.org/drawingml/2006/main">
+                    <a:graphicData uri="http://schemas.openxmlformats.org/drawingml/2006/picture">
+                      <pic:pic xmlns:pic="http://schemas.openxmlformats.org/drawingml/2006/picture">
+                        <pic:nvPicPr>
+                          <pic:cNvPr id="0" name="Picture 10"/>
+                          <pic:cNvPicPr>
+                            <a:picLocks noChangeAspect="1" noChangeArrowheads="1"/>
+                          </pic:cNvPicPr>
+                        </pic:nvPicPr>
+                        <pic:blipFill>
+                          <a:blip r:embed="rId10">
+                            <a:extLst>
+                              <a:ext uri="{28A0092B-C50C-407E-A947-70E740481C1C}">
+                                <a14:useLocalDpi xmlns:a14="http://schemas.microsoft.com/office/drawing/2010/main" val="0"/>
+                              </a:ext>
+                            </a:extLst>
+                          </a:blip>
+                          <a:srcRect/>
+                          <a:stretch>
+                            <a:fillRect/>
+                          </a:stretch>
+                        </pic:blipFill>
+                        <pic:spPr bwMode="auto">
+                          <a:xfrm>
+                            <a:off x="0" y="0"/>
+                            <a:ext cx="2044700" cy="2010750"/>
+                          </a:xfrm>
+                          <a:prstGeom prst="rect">
+                            <a:avLst/>
+                          </a:prstGeom>
+                          <a:noFill/>
+                          <a:ln>
+                            <a:noFill/>
+                          </a:ln>
+                        </pic:spPr>
+                      </pic:pic>
+                    </a:graphicData>
+                  </a:graphic>
+                </wp:inline>
+              </w:drawing>
+            </w:r>
+          </w:p>
+        </w:tc>
+      </w:tr>
+    </w:tbl>
+    <w:p>
+      <w:pPr>
+        <w:spacing w:after="200" w:line="276" w:lineRule="auto"/>
+        <w:rPr>
+          <w:rFonts w:ascii="Times New Roman" w:hAnsi="Times New Roman" w:cs="Times New Roman"/>
+          <w:b/>
+          <w:sz w:val="24"/>
+          <w:szCs w:val="24"/>
+        </w:rPr>
       </w:pPr>
       <w:r>
-        <w:t>spark.sql.adaptive.skewJoin.skewedPartitionFactor = 5</w:t>
+        <w:rPr>
+          <w:rFonts w:ascii="Times New Roman" w:hAnsi="Times New Roman" w:cs="Times New Roman"/>
+          <w:b/>
+          <w:sz w:val="24"/>
+          <w:szCs w:val="24"/>
+        </w:rPr>
+        <w:t xml:space="preserve">Fig. 1 </w:t>
+      </w:r>
+      <w:r>
+        <w:rPr>
+          <w:rFonts w:ascii="Times New Roman" w:hAnsi="Times New Roman" w:cs="Times New Roman"/>
+          <w:bCs/>
+          <w:sz w:val="24"/>
+          <w:szCs w:val="24"/>
+        </w:rPr>
+        <w:t>Pipeline layer performance</w:t>
+      </w:r>
+      <w:r>
+        <w:rPr>
+          <w:rFonts w:ascii="Times New Roman" w:hAnsi="Times New Roman" w:cs="Times New Roman"/>
+          <w:bCs/>
+          <w:sz w:val="24"/>
+          <w:szCs w:val="24"/>
+        </w:rPr>
+        <w:t xml:space="preserve"> in Databricks</w:t>
       </w:r>
     </w:p>
     <w:p>
       <w:pPr>
-        <w:pStyle w:val="ListBullet"/>
+        <w:spacing w:after="200" w:line="276" w:lineRule="auto"/>
+        <w:rPr>
+          <w:rFonts w:ascii="Times New Roman" w:hAnsi="Times New Roman" w:cs="Times New Roman"/>
+          <w:b/>
+          <w:sz w:val="28"/>
+          <w:szCs w:val="28"/>
+        </w:rPr>
       </w:pPr>
       <w:r>
-        <w:t>spark.sql.adaptive.skewJoin.skewedPartitionThresholdInBytes = 64MB</w:t>
+        <w:rPr>
+          <w:rFonts w:ascii="Times New Roman" w:hAnsi="Times New Roman" w:cs="Times New Roman"/>
+          <w:b/>
+          <w:sz w:val="28"/>
+          <w:szCs w:val="28"/>
+        </w:rPr>
+        <w:br w:type="page"/>
       </w:r>
-    </w:p>
-    <w:p>
       <w:r>
-        <w:t>(2) For the heavy-hitters, apply salting before the GROUP BY: add a random suffix 0–N to mention, aggregate twice (salted then unsalted), and the load spreads evenly across reducers. Conceptually:</w:t>
+        <w:rPr>
+          <w:rFonts w:ascii="Times New Roman" w:hAnsi="Times New Roman" w:cs="Times New Roman"/>
+          <w:b/>
+          <w:sz w:val="28"/>
+          <w:szCs w:val="28"/>
+        </w:rPr>
+        <w:lastRenderedPageBreak/>
+        <w:t>Optimizations</w:t>
+      </w:r>
+      <w:r>
+        <w:rPr>
+          <w:rFonts w:ascii="Times New Roman" w:hAnsi="Times New Roman" w:cs="Times New Roman"/>
+          <w:b/>
+          <w:sz w:val="28"/>
+          <w:szCs w:val="28"/>
+        </w:rPr>
+        <w:t xml:space="preserve"> Recommendations</w:t>
       </w:r>
     </w:p>
     <w:p>
       <w:pPr>
-        <w:ind w:left="432"/>
+        <w:spacing w:before="240" w:line="360" w:lineRule="auto"/>
+        <w:rPr>
+          <w:rFonts w:ascii="Times New Roman" w:hAnsi="Times New Roman" w:cs="Times New Roman"/>
+          <w:b/>
+          <w:sz w:val="24"/>
+          <w:szCs w:val="24"/>
+          <w:u w:val="single"/>
+        </w:rPr>
       </w:pPr>
       <w:r>
         <w:rPr>
-          <w:rFonts w:ascii="Consolas" w:hAnsi="Consolas"/>
-          <w:sz w:val="18"/>
+          <w:rFonts w:ascii="Times New Roman" w:hAnsi="Times New Roman" w:cs="Times New Roman"/>
+          <w:b/>
+          <w:sz w:val="24"/>
+          <w:szCs w:val="24"/>
+          <w:u w:val="single"/>
         </w:rPr>
-        <w:t>WITH salted AS (</w:t>
-      </w:r>
-      <w:r>
-        <w:rPr>
-          <w:rFonts w:ascii="Consolas" w:hAnsi="Consolas"/>
-          <w:sz w:val="18"/>
-        </w:rPr>
-        <w:br/>
-        <w:t xml:space="preserve">  SELECT mention,</w:t>
-      </w:r>
-      <w:r>
-        <w:rPr>
-          <w:rFonts w:ascii="Consolas" w:hAnsi="Consolas"/>
-          <w:sz w:val="18"/>
-        </w:rPr>
-        <w:br/>
-        <w:t xml:space="preserve">         CONCAT(mention, '_', CAST(FLOOR(RAND()*16) AS INT)) AS salted_mention,</w:t>
-      </w:r>
-      <w:r>
-        <w:rPr>
-          <w:rFonts w:ascii="Consolas" w:hAnsi="Consolas"/>
-          <w:sz w:val="18"/>
-        </w:rPr>
-        <w:br/>
-        <w:t xml:space="preserve">         predicted_sentiment, timestamp</w:t>
-      </w:r>
-      <w:r>
-        <w:rPr>
-          <w:rFonts w:ascii="Consolas" w:hAnsi="Consolas"/>
-          <w:sz w:val="18"/>
-        </w:rPr>
-        <w:br/>
-        <w:t xml:space="preserve">  FROM tweets_gold WHERE mention IS NOT NULL</w:t>
-      </w:r>
-      <w:r>
-        <w:rPr>
-          <w:rFonts w:ascii="Consolas" w:hAnsi="Consolas"/>
-          <w:sz w:val="18"/>
-        </w:rPr>
-        <w:br/>
-        <w:t>),</w:t>
-      </w:r>
-      <w:r>
-        <w:rPr>
-          <w:rFonts w:ascii="Consolas" w:hAnsi="Consolas"/>
-          <w:sz w:val="18"/>
-        </w:rPr>
-        <w:br/>
-        <w:t>stage1 AS (</w:t>
-      </w:r>
-      <w:r>
-        <w:rPr>
-          <w:rFonts w:ascii="Consolas" w:hAnsi="Consolas"/>
-          <w:sz w:val="18"/>
-        </w:rPr>
-        <w:br/>
-        <w:t xml:space="preserve">  SELECT mention, salted_mention,</w:t>
-      </w:r>
-      <w:r>
-        <w:rPr>
-          <w:rFonts w:ascii="Consolas" w:hAnsi="Consolas"/>
-          <w:sz w:val="18"/>
-        </w:rPr>
-        <w:br/>
-        <w:t xml:space="preserve">         COUNT(*) FILTER (WHERE predicted_sentiment='positive') AS pos,</w:t>
-      </w:r>
-      <w:r>
-        <w:rPr>
-          <w:rFonts w:ascii="Consolas" w:hAnsi="Consolas"/>
-          <w:sz w:val="18"/>
-        </w:rPr>
-        <w:br/>
-        <w:t xml:space="preserve">         COUNT(*) FILTER (WHERE predicted_sentiment='negative') AS neg</w:t>
-      </w:r>
-      <w:r>
-        <w:rPr>
-          <w:rFonts w:ascii="Consolas" w:hAnsi="Consolas"/>
-          <w:sz w:val="18"/>
-        </w:rPr>
-        <w:br/>
-        <w:t xml:space="preserve">  FROM salted GROUP BY mention, salted_mention</w:t>
-      </w:r>
-      <w:r>
-        <w:rPr>
-          <w:rFonts w:ascii="Consolas" w:hAnsi="Consolas"/>
-          <w:sz w:val="18"/>
-        </w:rPr>
-        <w:br/>
-        <w:t>)</w:t>
-      </w:r>
-      <w:r>
-        <w:rPr>
-          <w:rFonts w:ascii="Consolas" w:hAnsi="Consolas"/>
-          <w:sz w:val="18"/>
-        </w:rPr>
-        <w:br/>
-        <w:t>SELECT mention, SUM(pos) AS positive, SUM(neg) AS negative</w:t>
-      </w:r>
-      <w:r>
-        <w:rPr>
-          <w:rFonts w:ascii="Consolas" w:hAnsi="Consolas"/>
-          <w:sz w:val="18"/>
-        </w:rPr>
-        <w:br/>
-        <w:t>FROM stage1 GROUP BY mention</w:t>
-      </w:r>
-      <w:r>
-        <w:rPr>
-          <w:rFonts w:ascii="Consolas" w:hAnsi="Consolas"/>
-          <w:sz w:val="18"/>
-        </w:rPr>
-        <w:t>;</w:t>
-      </w:r>
-    </w:p>
-    <w:p>
-      <w:r>
-        <w:rPr>
-          <w:b/>
-        </w:rPr>
-        <w:t xml:space="preserve">Expected impact: </w:t>
-      </w:r>
-      <w:r>
-        <w:t>Max-task duration drops to within ~2× of median; aggregation stage time improves 3–6× on celebrity-heavy partitions; spill on the skewed reducers is eliminated.</w:t>
+        <w:t>Serialization / UDF overhead</w:t>
       </w:r>
     </w:p>
     <w:p>
       <w:pPr>
-        <w:pStyle w:val="Heading2"/>
+        <w:spacing w:line="221" w:lineRule="auto"/>
+        <w:ind w:firstLine="720"/>
+        <w:rPr>
+          <w:rFonts w:ascii="Times New Roman" w:hAnsi="Times New Roman" w:cs="Times New Roman"/>
+          <w:sz w:val="24"/>
+          <w:szCs w:val="24"/>
+        </w:rPr>
       </w:pPr>
       <w:r>
         <w:rPr>
-          <w:color w:val="1F3A5F"/>
+          <w:rFonts w:ascii="Times New Roman" w:hAnsi="Times New Roman" w:cs="Times New Roman"/>
+          <w:sz w:val="24"/>
+          <w:szCs w:val="24"/>
         </w:rPr>
-        <w:lastRenderedPageBreak/>
-        <w:t>2. Serialization – Python UDF &amp; Model Inference Overhead</w:t>
+        <w:t xml:space="preserve">The Gold </w:t>
       </w:r>
-    </w:p>
-    <w:p>
       <w:r>
         <w:rPr>
-          <w:b/>
+          <w:rFonts w:ascii="Times New Roman" w:hAnsi="Times New Roman" w:cs="Times New Roman"/>
+          <w:sz w:val="24"/>
+          <w:szCs w:val="24"/>
         </w:rPr>
-        <w:t xml:space="preserve">Symptom: </w:t>
+        <w:t>layer</w:t>
       </w:r>
       <w:r>
-        <w:t>silver_tweet_transform.py defines find_mentions_udf, a pure-Python regex UDF wrapped with udf(...). Every row pays the JVM→Python pickle/unpickle round-trip, and Spark cannot push predicates or codegen through it. The Spark UI 'Executor Run Time' for the Silver stage is dominated by 'Time spent in Python workers'. In Gold, mlflow.pyfunc.spark_udf invokes a transformer model row-by-row, which is the single largest hot spot in the pipeline.</w:t>
+        <w:rPr>
+          <w:rFonts w:ascii="Times New Roman" w:hAnsi="Times New Roman" w:cs="Times New Roman"/>
+          <w:sz w:val="24"/>
+          <w:szCs w:val="24"/>
+        </w:rPr>
+        <w:t xml:space="preserve"> is the clear bottleneck</w:t>
       </w:r>
-    </w:p>
-    <w:p>
       <w:r>
         <w:rPr>
-          <w:b/>
+          <w:rFonts w:ascii="Times New Roman" w:hAnsi="Times New Roman" w:cs="Times New Roman"/>
+          <w:sz w:val="24"/>
+          <w:szCs w:val="24"/>
         </w:rPr>
-        <w:t xml:space="preserve">Proposed alternatives: </w:t>
+        <w:t xml:space="preserve"> as</w:t>
+      </w:r>
+      <w:r>
+        <w:rPr>
+          <w:rFonts w:ascii="Times New Roman" w:hAnsi="Times New Roman" w:cs="Times New Roman"/>
+          <w:sz w:val="24"/>
+          <w:szCs w:val="24"/>
+        </w:rPr>
+        <w:t xml:space="preserve"> 43.7K rows required 1.03 h of aggregate task time, with Photon at 0% and an Arrow Eval Python operator. This indicates model inference and Python execution dominate. The Silver </w:t>
+      </w:r>
+      <w:r>
+        <w:rPr>
+          <w:rFonts w:ascii="Times New Roman" w:hAnsi="Times New Roman" w:cs="Times New Roman"/>
+          <w:sz w:val="24"/>
+          <w:szCs w:val="24"/>
+        </w:rPr>
+        <w:t>layer</w:t>
+      </w:r>
+      <w:r>
+        <w:rPr>
+          <w:rFonts w:ascii="Times New Roman" w:hAnsi="Times New Roman" w:cs="Times New Roman"/>
+          <w:sz w:val="24"/>
+          <w:szCs w:val="24"/>
+        </w:rPr>
+        <w:t xml:space="preserve"> also uses </w:t>
+      </w:r>
+      <w:proofErr w:type="gramStart"/>
+      <w:r>
+        <w:rPr>
+          <w:rFonts w:ascii="Times New Roman" w:hAnsi="Times New Roman" w:cs="Times New Roman"/>
+          <w:sz w:val="24"/>
+          <w:szCs w:val="24"/>
+        </w:rPr>
+        <w:t>a Python</w:t>
+      </w:r>
+      <w:proofErr w:type="gramEnd"/>
+      <w:r>
+        <w:rPr>
+          <w:rFonts w:ascii="Times New Roman" w:hAnsi="Times New Roman" w:cs="Times New Roman"/>
+          <w:sz w:val="24"/>
+          <w:szCs w:val="24"/>
+        </w:rPr>
+        <w:t xml:space="preserve"> regex UDF, but its runtime was only about four seconds. </w:t>
+      </w:r>
+      <w:r>
+        <w:rPr>
+          <w:rFonts w:ascii="Times New Roman" w:hAnsi="Times New Roman" w:cs="Times New Roman"/>
+          <w:sz w:val="24"/>
+          <w:szCs w:val="24"/>
+        </w:rPr>
+        <w:t>The r</w:t>
+      </w:r>
+      <w:r>
+        <w:rPr>
+          <w:rFonts w:ascii="Times New Roman" w:hAnsi="Times New Roman" w:cs="Times New Roman"/>
+          <w:sz w:val="24"/>
+          <w:szCs w:val="24"/>
+        </w:rPr>
+        <w:t>ecommended action</w:t>
+      </w:r>
+      <w:r>
+        <w:rPr>
+          <w:rFonts w:ascii="Times New Roman" w:hAnsi="Times New Roman" w:cs="Times New Roman"/>
+          <w:sz w:val="24"/>
+          <w:szCs w:val="24"/>
+        </w:rPr>
+        <w:t xml:space="preserve"> is to</w:t>
+      </w:r>
+      <w:r>
+        <w:rPr>
+          <w:rFonts w:ascii="Times New Roman" w:hAnsi="Times New Roman" w:cs="Times New Roman"/>
+          <w:sz w:val="24"/>
+          <w:szCs w:val="24"/>
+        </w:rPr>
+        <w:t xml:space="preserve"> use native Spark regex functions for mention extraction, and batch transformer inference by tuning Arrow batch size / model batch size while loading the model once per executor. </w:t>
+      </w:r>
+      <w:r>
+        <w:rPr>
+          <w:rFonts w:ascii="Times New Roman" w:hAnsi="Times New Roman" w:cs="Times New Roman"/>
+          <w:sz w:val="24"/>
+          <w:szCs w:val="24"/>
+        </w:rPr>
+        <w:t>This can make</w:t>
+      </w:r>
+      <w:r>
+        <w:rPr>
+          <w:rFonts w:ascii="Times New Roman" w:hAnsi="Times New Roman" w:cs="Times New Roman"/>
+          <w:sz w:val="24"/>
+          <w:szCs w:val="24"/>
+        </w:rPr>
+        <w:t xml:space="preserve"> </w:t>
+      </w:r>
+      <w:proofErr w:type="gramStart"/>
+      <w:r>
+        <w:rPr>
+          <w:rFonts w:ascii="Times New Roman" w:hAnsi="Times New Roman" w:cs="Times New Roman"/>
+          <w:sz w:val="24"/>
+          <w:szCs w:val="24"/>
+        </w:rPr>
+        <w:t>Silver</w:t>
+      </w:r>
+      <w:proofErr w:type="gramEnd"/>
+      <w:r>
+        <w:rPr>
+          <w:rFonts w:ascii="Times New Roman" w:hAnsi="Times New Roman" w:cs="Times New Roman"/>
+          <w:sz w:val="24"/>
+          <w:szCs w:val="24"/>
+        </w:rPr>
+        <w:t xml:space="preserve"> </w:t>
+      </w:r>
+      <w:r>
+        <w:rPr>
+          <w:rFonts w:ascii="Times New Roman" w:hAnsi="Times New Roman" w:cs="Times New Roman"/>
+          <w:sz w:val="24"/>
+          <w:szCs w:val="24"/>
+        </w:rPr>
+        <w:t xml:space="preserve">layer </w:t>
+      </w:r>
+      <w:r>
+        <w:rPr>
+          <w:rFonts w:ascii="Times New Roman" w:hAnsi="Times New Roman" w:cs="Times New Roman"/>
+          <w:sz w:val="24"/>
+          <w:szCs w:val="24"/>
+        </w:rPr>
+        <w:t>overhead falls 30-5</w:t>
+      </w:r>
+      <w:r>
+        <w:rPr>
+          <w:rFonts w:ascii="Times New Roman" w:hAnsi="Times New Roman" w:cs="Times New Roman"/>
+          <w:sz w:val="24"/>
+          <w:szCs w:val="24"/>
+        </w:rPr>
+        <w:t xml:space="preserve">0%, and </w:t>
+      </w:r>
+      <w:proofErr w:type="gramStart"/>
+      <w:r>
+        <w:rPr>
+          <w:rFonts w:ascii="Times New Roman" w:hAnsi="Times New Roman" w:cs="Times New Roman"/>
+          <w:sz w:val="24"/>
+          <w:szCs w:val="24"/>
+        </w:rPr>
+        <w:t>Gold</w:t>
+      </w:r>
+      <w:proofErr w:type="gramEnd"/>
+      <w:r>
+        <w:rPr>
+          <w:rFonts w:ascii="Times New Roman" w:hAnsi="Times New Roman" w:cs="Times New Roman"/>
+          <w:sz w:val="24"/>
+          <w:szCs w:val="24"/>
+        </w:rPr>
+        <w:t xml:space="preserve"> </w:t>
+      </w:r>
+      <w:r>
+        <w:rPr>
+          <w:rFonts w:ascii="Times New Roman" w:hAnsi="Times New Roman" w:cs="Times New Roman"/>
+          <w:sz w:val="24"/>
+          <w:szCs w:val="24"/>
+        </w:rPr>
+        <w:t xml:space="preserve">layer </w:t>
+      </w:r>
+      <w:r>
+        <w:rPr>
+          <w:rFonts w:ascii="Times New Roman" w:hAnsi="Times New Roman" w:cs="Times New Roman"/>
+          <w:sz w:val="24"/>
+          <w:szCs w:val="24"/>
+        </w:rPr>
+        <w:t>transformer throughput can improve several times over.</w:t>
       </w:r>
     </w:p>
     <w:p>
       <w:pPr>
-        <w:pStyle w:val="ListBullet"/>
+        <w:spacing w:before="60" w:line="360" w:lineRule="auto"/>
+        <w:rPr>
+          <w:rFonts w:ascii="Times New Roman" w:hAnsi="Times New Roman" w:cs="Times New Roman"/>
+          <w:b/>
+          <w:sz w:val="24"/>
+          <w:szCs w:val="24"/>
+          <w:u w:val="single"/>
+        </w:rPr>
       </w:pPr>
       <w:r>
-        <w:t>Replace find_mentions_udf with the native Spark function regexp_extract_all(text, '@\\w+', 0). It is implemented in the JVM, supports codegen, and avoids Python serialization entirely. The current .withColumn("cleaned_text", regexp_replace(...)) already proves the native regex engine matches our pattern.</w:t>
+        <w:rPr>
+          <w:rFonts w:ascii="Times New Roman" w:hAnsi="Times New Roman" w:cs="Times New Roman"/>
+          <w:b/>
+          <w:sz w:val="24"/>
+          <w:szCs w:val="24"/>
+          <w:u w:val="single"/>
+        </w:rPr>
+        <w:t>Shuffle, spill, and skew</w:t>
       </w:r>
     </w:p>
     <w:p>
       <w:pPr>
-        <w:pStyle w:val="ListBullet"/>
+        <w:spacing w:line="221" w:lineRule="auto"/>
+        <w:ind w:firstLine="720"/>
+        <w:rPr>
+          <w:rFonts w:ascii="Times New Roman" w:hAnsi="Times New Roman" w:cs="Times New Roman"/>
+          <w:sz w:val="24"/>
+          <w:szCs w:val="24"/>
+        </w:rPr>
       </w:pPr>
       <w:r>
-        <w:t>If a Python UDF is unavoidable, switch to a Pandas UDF (Arrow-based, vectorized) with @pandas_udf(ArrayType(StringType())); this batches rows into Arrow record batches and amortizes the worker round-trip 100–1000× over per-row UDFs.</w:t>
+        <w:rPr>
+          <w:rFonts w:ascii="Times New Roman" w:hAnsi="Times New Roman" w:cs="Times New Roman"/>
+          <w:sz w:val="24"/>
+          <w:szCs w:val="24"/>
+        </w:rPr>
+        <w:t xml:space="preserve">The application view uses Shuffle and Grouping Aggregate on mention, but the measured run was small: 829 KB read, 17,985 rows written, 82% Photon task time, and 0 bytes spilled to disk. This means there is no current spill problem. However, mention data can become skewed because celebrity or brand handles receive many mentions. </w:t>
+      </w:r>
+      <w:r>
+        <w:rPr>
+          <w:rFonts w:ascii="Times New Roman" w:hAnsi="Times New Roman" w:cs="Times New Roman"/>
+          <w:sz w:val="24"/>
+          <w:szCs w:val="24"/>
+        </w:rPr>
+        <w:t>For better performance,</w:t>
+      </w:r>
+      <w:r>
+        <w:rPr>
+          <w:rFonts w:ascii="Times New Roman" w:hAnsi="Times New Roman" w:cs="Times New Roman"/>
+          <w:sz w:val="24"/>
+          <w:szCs w:val="24"/>
+        </w:rPr>
+        <w:t xml:space="preserve"> keep Adaptive Query Execution enabled, coalesce small shuffle partitions, and use salting only if one or two handles begin creating long reducer tasks</w:t>
+      </w:r>
+      <w:r>
+        <w:rPr>
+          <w:rFonts w:ascii="Times New Roman" w:hAnsi="Times New Roman" w:cs="Times New Roman"/>
+          <w:sz w:val="24"/>
+          <w:szCs w:val="24"/>
+        </w:rPr>
+        <w:t xml:space="preserve">. This may </w:t>
+      </w:r>
+      <w:r>
+        <w:rPr>
+          <w:rFonts w:ascii="Times New Roman" w:hAnsi="Times New Roman" w:cs="Times New Roman"/>
+          <w:sz w:val="24"/>
+          <w:szCs w:val="24"/>
+        </w:rPr>
+        <w:t>prevent future straggler tasks while avoiding unnecessary complexity now.</w:t>
       </w:r>
     </w:p>
     <w:p>
       <w:pPr>
-        <w:pStyle w:val="ListBullet"/>
+        <w:spacing w:before="60" w:line="360" w:lineRule="auto"/>
+        <w:rPr>
+          <w:rFonts w:ascii="Times New Roman" w:hAnsi="Times New Roman" w:cs="Times New Roman"/>
+          <w:b/>
+          <w:sz w:val="24"/>
+          <w:szCs w:val="24"/>
+          <w:u w:val="single"/>
+        </w:rPr>
       </w:pPr>
       <w:r>
-        <w:t>For the ML model in gold_tweet_transform.py, configure mlflow.pyfunc.spark_udf with env_manager='local' and ensure batched inference: set spark.sql.execution.arrow.maxRecordsPerBatch = 256 and tune the Hugging Face pipeline batch_size so each Arrow batch becomes a single forward pass on the model.</w:t>
+        <w:rPr>
+          <w:rFonts w:ascii="Times New Roman" w:hAnsi="Times New Roman" w:cs="Times New Roman"/>
+          <w:b/>
+          <w:sz w:val="24"/>
+          <w:szCs w:val="24"/>
+          <w:u w:val="single"/>
+        </w:rPr>
+        <w:t xml:space="preserve">Storage </w:t>
+      </w:r>
+      <w:r>
+        <w:rPr>
+          <w:rFonts w:ascii="Times New Roman" w:hAnsi="Times New Roman" w:cs="Times New Roman"/>
+          <w:b/>
+          <w:sz w:val="24"/>
+          <w:szCs w:val="24"/>
+          <w:u w:val="single"/>
+        </w:rPr>
+        <w:t>&amp;</w:t>
+      </w:r>
+      <w:r>
+        <w:rPr>
+          <w:rFonts w:ascii="Times New Roman" w:hAnsi="Times New Roman" w:cs="Times New Roman"/>
+          <w:b/>
+          <w:sz w:val="24"/>
+          <w:szCs w:val="24"/>
+          <w:u w:val="single"/>
+        </w:rPr>
+        <w:t xml:space="preserve"> Delta layout</w:t>
       </w:r>
     </w:p>
     <w:p>
       <w:pPr>
-        <w:pStyle w:val="ListBullet"/>
+        <w:spacing w:line="221" w:lineRule="auto"/>
+        <w:ind w:firstLine="720"/>
+        <w:rPr>
+          <w:rFonts w:ascii="Times New Roman" w:hAnsi="Times New Roman" w:cs="Times New Roman"/>
+          <w:szCs w:val="16"/>
+        </w:rPr>
       </w:pPr>
       <w:r>
-        <w:t>Broadcast the model once per executor (cache module-level inside the UDF) rather than reloading per-task, eliminating cold-start latency on every batch.</w:t>
+        <w:rPr>
+          <w:rFonts w:ascii="Times New Roman" w:hAnsi="Times New Roman" w:cs="Times New Roman"/>
+          <w:sz w:val="24"/>
+          <w:szCs w:val="24"/>
+        </w:rPr>
+        <w:t>The measured refresh read and wrote one file per layer, so file fragmentation was not visible in this run</w:t>
       </w:r>
-    </w:p>
-    <w:p>
       <w:r>
         <w:rPr>
-          <w:b/>
+          <w:rFonts w:ascii="Times New Roman" w:hAnsi="Times New Roman" w:cs="Times New Roman"/>
+          <w:sz w:val="24"/>
+          <w:szCs w:val="24"/>
         </w:rPr>
-        <w:t xml:space="preserve">Expected impact: </w:t>
+        <w:t>. S</w:t>
       </w:r>
       <w:r>
-        <w:t>Replacing the regex UDF with regexp_extract_all alone removes the Python worker stage from Silver entirely (estimated 30–50% Silver wall-clock reduction). Vectorized + batched inference on Gold typically yields 5–10× throughput on transformer UDFs.</w:t>
+        <w:rPr>
+          <w:rFonts w:ascii="Times New Roman" w:hAnsi="Times New Roman" w:cs="Times New Roman"/>
+          <w:sz w:val="24"/>
+          <w:szCs w:val="24"/>
+        </w:rPr>
+        <w:t>treaming pipelines often create small Delta files over repeated daily runs. Recommend</w:t>
+      </w:r>
+      <w:r>
+        <w:rPr>
+          <w:rFonts w:ascii="Times New Roman" w:hAnsi="Times New Roman" w:cs="Times New Roman"/>
+          <w:sz w:val="24"/>
+          <w:szCs w:val="24"/>
+        </w:rPr>
+        <w:t>ation is to</w:t>
+      </w:r>
+      <w:r>
+        <w:rPr>
+          <w:rFonts w:ascii="Times New Roman" w:hAnsi="Times New Roman" w:cs="Times New Roman"/>
+          <w:sz w:val="24"/>
+          <w:szCs w:val="24"/>
+        </w:rPr>
+        <w:t xml:space="preserve"> enable optimized writes/auto compaction for </w:t>
+      </w:r>
+      <w:proofErr w:type="gramStart"/>
+      <w:r>
+        <w:rPr>
+          <w:rFonts w:ascii="Times New Roman" w:hAnsi="Times New Roman" w:cs="Times New Roman"/>
+          <w:sz w:val="24"/>
+          <w:szCs w:val="24"/>
+        </w:rPr>
+        <w:t>Silver and Gold</w:t>
+      </w:r>
+      <w:proofErr w:type="gramEnd"/>
+      <w:r>
+        <w:rPr>
+          <w:rFonts w:ascii="Times New Roman" w:hAnsi="Times New Roman" w:cs="Times New Roman"/>
+          <w:sz w:val="24"/>
+          <w:szCs w:val="24"/>
+        </w:rPr>
+        <w:t xml:space="preserve"> </w:t>
+      </w:r>
+      <w:r>
+        <w:rPr>
+          <w:rFonts w:ascii="Times New Roman" w:hAnsi="Times New Roman" w:cs="Times New Roman"/>
+          <w:sz w:val="24"/>
+          <w:szCs w:val="24"/>
+        </w:rPr>
+        <w:t xml:space="preserve">layers </w:t>
+      </w:r>
+      <w:r>
+        <w:rPr>
+          <w:rFonts w:ascii="Times New Roman" w:hAnsi="Times New Roman" w:cs="Times New Roman"/>
+          <w:sz w:val="24"/>
+          <w:szCs w:val="24"/>
+        </w:rPr>
+        <w:t xml:space="preserve">after daily loads, optimize or liquid-cluster </w:t>
+      </w:r>
+      <w:proofErr w:type="gramStart"/>
+      <w:r>
+        <w:rPr>
+          <w:rFonts w:ascii="Times New Roman" w:hAnsi="Times New Roman" w:cs="Times New Roman"/>
+          <w:sz w:val="24"/>
+          <w:szCs w:val="24"/>
+        </w:rPr>
+        <w:t>Gold</w:t>
+      </w:r>
+      <w:proofErr w:type="gramEnd"/>
+      <w:r>
+        <w:rPr>
+          <w:rFonts w:ascii="Times New Roman" w:hAnsi="Times New Roman" w:cs="Times New Roman"/>
+          <w:sz w:val="24"/>
+          <w:szCs w:val="24"/>
+        </w:rPr>
+        <w:t xml:space="preserve"> </w:t>
+      </w:r>
+      <w:r>
+        <w:rPr>
+          <w:rFonts w:ascii="Times New Roman" w:hAnsi="Times New Roman" w:cs="Times New Roman"/>
+          <w:sz w:val="24"/>
+          <w:szCs w:val="24"/>
+        </w:rPr>
+        <w:t xml:space="preserve">layer </w:t>
+      </w:r>
+      <w:r>
+        <w:rPr>
+          <w:rFonts w:ascii="Times New Roman" w:hAnsi="Times New Roman" w:cs="Times New Roman"/>
+          <w:sz w:val="24"/>
+          <w:szCs w:val="24"/>
+        </w:rPr>
+        <w:t xml:space="preserve">by mention and timestamp because dashboard and aggregation workloads are </w:t>
+      </w:r>
+      <w:proofErr w:type="gramStart"/>
+      <w:r>
+        <w:rPr>
+          <w:rFonts w:ascii="Times New Roman" w:hAnsi="Times New Roman" w:cs="Times New Roman"/>
+          <w:sz w:val="24"/>
+          <w:szCs w:val="24"/>
+        </w:rPr>
+        <w:t>mention</w:t>
+      </w:r>
+      <w:proofErr w:type="gramEnd"/>
+      <w:r>
+        <w:rPr>
+          <w:rFonts w:ascii="Times New Roman" w:hAnsi="Times New Roman" w:cs="Times New Roman"/>
+          <w:sz w:val="24"/>
+          <w:szCs w:val="24"/>
+        </w:rPr>
+        <w:t xml:space="preserve">/time-oriented. </w:t>
+      </w:r>
+      <w:r>
+        <w:rPr>
+          <w:rFonts w:ascii="Times New Roman" w:hAnsi="Times New Roman" w:cs="Times New Roman"/>
+          <w:sz w:val="24"/>
+          <w:szCs w:val="24"/>
+        </w:rPr>
+        <w:t xml:space="preserve">This can </w:t>
+      </w:r>
+      <w:r>
+        <w:rPr>
+          <w:rFonts w:ascii="Times New Roman" w:hAnsi="Times New Roman" w:cs="Times New Roman"/>
+          <w:sz w:val="24"/>
+          <w:szCs w:val="24"/>
+        </w:rPr>
+        <w:t>lower metadata planning overhead and faster dashboard scans as data accumulates.</w:t>
+      </w:r>
+      <w:r>
+        <w:rPr>
+          <w:rFonts w:ascii="Times New Roman" w:hAnsi="Times New Roman" w:cs="Times New Roman"/>
+          <w:sz w:val="24"/>
+          <w:szCs w:val="24"/>
+        </w:rPr>
+        <w:br/>
       </w:r>
     </w:p>
     <w:p>
       <w:pPr>
-        <w:pStyle w:val="Heading2"/>
+        <w:spacing w:before="40" w:line="360" w:lineRule="auto"/>
+        <w:rPr>
+          <w:rFonts w:ascii="Times New Roman" w:hAnsi="Times New Roman" w:cs="Times New Roman"/>
+          <w:sz w:val="24"/>
+          <w:szCs w:val="24"/>
+        </w:rPr>
       </w:pPr>
       <w:r>
         <w:rPr>
-          <w:color w:val="1F3A5F"/>
+          <w:rFonts w:ascii="Times New Roman" w:hAnsi="Times New Roman" w:cs="Times New Roman"/>
+          <w:b/>
+          <w:sz w:val="24"/>
+          <w:szCs w:val="24"/>
         </w:rPr>
-        <w:t>3. Storage – Small Files, OPTIMIZE, and ZORDER</w:t>
+        <w:t>Model Performance Analysis</w:t>
       </w:r>
     </w:p>
+    <w:tbl>
+      <w:tblPr>
+        <w:tblStyle w:val="TableGrid"/>
+        <w:tblW w:w="0" w:type="auto"/>
+        <w:jc w:val="center"/>
+        <w:tblLook w:val="04A0" w:firstRow="1" w:lastRow="0" w:firstColumn="1" w:lastColumn="0" w:noHBand="0" w:noVBand="1"/>
+      </w:tblPr>
+      <w:tblGrid>
+        <w:gridCol w:w="1375"/>
+        <w:gridCol w:w="1492"/>
+        <w:gridCol w:w="1363"/>
+        <w:gridCol w:w="5238"/>
+      </w:tblGrid>
+      <w:tr>
+        <w:trPr>
+          <w:trHeight w:val="485"/>
+          <w:jc w:val="center"/>
+        </w:trPr>
+        <w:tc>
+          <w:tcPr>
+            <w:tcW w:w="1375" w:type="dxa"/>
+            <w:shd w:val="clear" w:color="auto" w:fill="E2F0D9"/>
+            <w:vAlign w:val="center"/>
+          </w:tcPr>
+          <w:p>
+            <w:pPr>
+              <w:jc w:val="center"/>
+              <w:rPr>
+                <w:rFonts w:ascii="Times New Roman" w:hAnsi="Times New Roman" w:cs="Times New Roman"/>
+                <w:b/>
+                <w:sz w:val="24"/>
+                <w:szCs w:val="24"/>
+              </w:rPr>
+            </w:pPr>
+            <w:r>
+              <w:rPr>
+                <w:rFonts w:ascii="Times New Roman" w:hAnsi="Times New Roman" w:cs="Times New Roman"/>
+                <w:b/>
+                <w:sz w:val="24"/>
+                <w:szCs w:val="24"/>
+              </w:rPr>
+              <w:t>Metric</w:t>
+            </w:r>
+          </w:p>
+        </w:tc>
+        <w:tc>
+          <w:tcPr>
+            <w:tcW w:w="1492" w:type="dxa"/>
+            <w:shd w:val="clear" w:color="auto" w:fill="E2F0D9"/>
+            <w:vAlign w:val="center"/>
+          </w:tcPr>
+          <w:p>
+            <w:pPr>
+              <w:jc w:val="center"/>
+              <w:rPr>
+                <w:rFonts w:ascii="Times New Roman" w:hAnsi="Times New Roman" w:cs="Times New Roman"/>
+                <w:b/>
+                <w:sz w:val="24"/>
+                <w:szCs w:val="24"/>
+              </w:rPr>
+            </w:pPr>
+            <w:r>
+              <w:rPr>
+                <w:rFonts w:ascii="Times New Roman" w:hAnsi="Times New Roman" w:cs="Times New Roman"/>
+                <w:b/>
+                <w:sz w:val="24"/>
+                <w:szCs w:val="24"/>
+              </w:rPr>
+              <w:t>Negative</w:t>
+            </w:r>
+          </w:p>
+        </w:tc>
+        <w:tc>
+          <w:tcPr>
+            <w:tcW w:w="1363" w:type="dxa"/>
+            <w:shd w:val="clear" w:color="auto" w:fill="E2F0D9"/>
+            <w:vAlign w:val="center"/>
+          </w:tcPr>
+          <w:p>
+            <w:pPr>
+              <w:jc w:val="center"/>
+              <w:rPr>
+                <w:rFonts w:ascii="Times New Roman" w:hAnsi="Times New Roman" w:cs="Times New Roman"/>
+                <w:b/>
+                <w:sz w:val="24"/>
+                <w:szCs w:val="24"/>
+              </w:rPr>
+            </w:pPr>
+            <w:r>
+              <w:rPr>
+                <w:rFonts w:ascii="Times New Roman" w:hAnsi="Times New Roman" w:cs="Times New Roman"/>
+                <w:b/>
+                <w:sz w:val="24"/>
+                <w:szCs w:val="24"/>
+              </w:rPr>
+              <w:t>Positive</w:t>
+            </w:r>
+          </w:p>
+        </w:tc>
+        <w:tc>
+          <w:tcPr>
+            <w:tcW w:w="5238" w:type="dxa"/>
+            <w:shd w:val="clear" w:color="auto" w:fill="E2F0D9"/>
+            <w:vAlign w:val="center"/>
+          </w:tcPr>
+          <w:p>
+            <w:pPr>
+              <w:jc w:val="center"/>
+              <w:rPr>
+                <w:rFonts w:ascii="Times New Roman" w:hAnsi="Times New Roman" w:cs="Times New Roman"/>
+                <w:b/>
+                <w:sz w:val="24"/>
+                <w:szCs w:val="24"/>
+              </w:rPr>
+            </w:pPr>
+            <w:r>
+              <w:rPr>
+                <w:rFonts w:ascii="Times New Roman" w:hAnsi="Times New Roman" w:cs="Times New Roman"/>
+                <w:b/>
+                <w:sz w:val="24"/>
+                <w:szCs w:val="24"/>
+              </w:rPr>
+              <w:t>Overall / Notes</w:t>
+            </w:r>
+          </w:p>
+        </w:tc>
+      </w:tr>
+      <w:tr>
+        <w:trPr>
+          <w:trHeight w:val="368"/>
+          <w:jc w:val="center"/>
+        </w:trPr>
+        <w:tc>
+          <w:tcPr>
+            <w:tcW w:w="1375" w:type="dxa"/>
+            <w:vAlign w:val="center"/>
+          </w:tcPr>
+          <w:p>
+            <w:pPr>
+              <w:rPr>
+                <w:rFonts w:ascii="Times New Roman" w:hAnsi="Times New Roman" w:cs="Times New Roman"/>
+                <w:b/>
+                <w:bCs/>
+                <w:sz w:val="24"/>
+                <w:szCs w:val="24"/>
+              </w:rPr>
+            </w:pPr>
+            <w:r>
+              <w:rPr>
+                <w:rFonts w:ascii="Times New Roman" w:hAnsi="Times New Roman" w:cs="Times New Roman"/>
+                <w:b/>
+                <w:bCs/>
+                <w:sz w:val="24"/>
+                <w:szCs w:val="24"/>
+              </w:rPr>
+              <w:t>Precision</w:t>
+            </w:r>
+          </w:p>
+        </w:tc>
+        <w:tc>
+          <w:tcPr>
+            <w:tcW w:w="1492" w:type="dxa"/>
+            <w:vAlign w:val="center"/>
+          </w:tcPr>
+          <w:p>
+            <w:pPr>
+              <w:jc w:val="center"/>
+              <w:rPr>
+                <w:rFonts w:ascii="Times New Roman" w:hAnsi="Times New Roman" w:cs="Times New Roman"/>
+                <w:sz w:val="24"/>
+                <w:szCs w:val="24"/>
+              </w:rPr>
+            </w:pPr>
+            <w:r>
+              <w:rPr>
+                <w:rFonts w:ascii="Times New Roman" w:hAnsi="Times New Roman" w:cs="Times New Roman"/>
+                <w:sz w:val="24"/>
+                <w:szCs w:val="24"/>
+              </w:rPr>
+              <w:t>0.682</w:t>
+            </w:r>
+          </w:p>
+        </w:tc>
+        <w:tc>
+          <w:tcPr>
+            <w:tcW w:w="1363" w:type="dxa"/>
+            <w:vAlign w:val="center"/>
+          </w:tcPr>
+          <w:p>
+            <w:pPr>
+              <w:jc w:val="center"/>
+              <w:rPr>
+                <w:rFonts w:ascii="Times New Roman" w:hAnsi="Times New Roman" w:cs="Times New Roman"/>
+                <w:sz w:val="24"/>
+                <w:szCs w:val="24"/>
+              </w:rPr>
+            </w:pPr>
+            <w:r>
+              <w:rPr>
+                <w:rFonts w:ascii="Times New Roman" w:hAnsi="Times New Roman" w:cs="Times New Roman"/>
+                <w:sz w:val="24"/>
+                <w:szCs w:val="24"/>
+              </w:rPr>
+              <w:t>0.759</w:t>
+            </w:r>
+          </w:p>
+        </w:tc>
+        <w:tc>
+          <w:tcPr>
+            <w:tcW w:w="5238" w:type="dxa"/>
+            <w:vAlign w:val="center"/>
+          </w:tcPr>
+          <w:p>
+            <w:pPr>
+              <w:rPr>
+                <w:rFonts w:ascii="Times New Roman" w:hAnsi="Times New Roman" w:cs="Times New Roman"/>
+                <w:sz w:val="24"/>
+                <w:szCs w:val="24"/>
+              </w:rPr>
+            </w:pPr>
+            <w:r>
+              <w:rPr>
+                <w:rFonts w:ascii="Times New Roman" w:hAnsi="Times New Roman" w:cs="Times New Roman"/>
+                <w:sz w:val="24"/>
+                <w:szCs w:val="24"/>
+              </w:rPr>
+              <w:t>Positive precision is stronger.</w:t>
+            </w:r>
+          </w:p>
+        </w:tc>
+      </w:tr>
+      <w:tr>
+        <w:trPr>
+          <w:trHeight w:val="359"/>
+          <w:jc w:val="center"/>
+        </w:trPr>
+        <w:tc>
+          <w:tcPr>
+            <w:tcW w:w="1375" w:type="dxa"/>
+            <w:vAlign w:val="center"/>
+          </w:tcPr>
+          <w:p>
+            <w:pPr>
+              <w:rPr>
+                <w:rFonts w:ascii="Times New Roman" w:hAnsi="Times New Roman" w:cs="Times New Roman"/>
+                <w:b/>
+                <w:bCs/>
+                <w:sz w:val="24"/>
+                <w:szCs w:val="24"/>
+              </w:rPr>
+            </w:pPr>
+            <w:r>
+              <w:rPr>
+                <w:rFonts w:ascii="Times New Roman" w:hAnsi="Times New Roman" w:cs="Times New Roman"/>
+                <w:b/>
+                <w:bCs/>
+                <w:sz w:val="24"/>
+                <w:szCs w:val="24"/>
+              </w:rPr>
+              <w:t>Recall</w:t>
+            </w:r>
+          </w:p>
+        </w:tc>
+        <w:tc>
+          <w:tcPr>
+            <w:tcW w:w="1492" w:type="dxa"/>
+            <w:vAlign w:val="center"/>
+          </w:tcPr>
+          <w:p>
+            <w:pPr>
+              <w:jc w:val="center"/>
+              <w:rPr>
+                <w:rFonts w:ascii="Times New Roman" w:hAnsi="Times New Roman" w:cs="Times New Roman"/>
+                <w:sz w:val="24"/>
+                <w:szCs w:val="24"/>
+              </w:rPr>
+            </w:pPr>
+            <w:r>
+              <w:rPr>
+                <w:rFonts w:ascii="Times New Roman" w:hAnsi="Times New Roman" w:cs="Times New Roman"/>
+                <w:sz w:val="24"/>
+                <w:szCs w:val="24"/>
+              </w:rPr>
+              <w:t>0.796</w:t>
+            </w:r>
+          </w:p>
+        </w:tc>
+        <w:tc>
+          <w:tcPr>
+            <w:tcW w:w="1363" w:type="dxa"/>
+            <w:vAlign w:val="center"/>
+          </w:tcPr>
+          <w:p>
+            <w:pPr>
+              <w:jc w:val="center"/>
+              <w:rPr>
+                <w:rFonts w:ascii="Times New Roman" w:hAnsi="Times New Roman" w:cs="Times New Roman"/>
+                <w:sz w:val="24"/>
+                <w:szCs w:val="24"/>
+              </w:rPr>
+            </w:pPr>
+            <w:r>
+              <w:rPr>
+                <w:rFonts w:ascii="Times New Roman" w:hAnsi="Times New Roman" w:cs="Times New Roman"/>
+                <w:sz w:val="24"/>
+                <w:szCs w:val="24"/>
+              </w:rPr>
+              <w:t>0.633</w:t>
+            </w:r>
+          </w:p>
+        </w:tc>
+        <w:tc>
+          <w:tcPr>
+            <w:tcW w:w="5238" w:type="dxa"/>
+            <w:vAlign w:val="center"/>
+          </w:tcPr>
+          <w:p>
+            <w:pPr>
+              <w:rPr>
+                <w:rFonts w:ascii="Times New Roman" w:hAnsi="Times New Roman" w:cs="Times New Roman"/>
+                <w:sz w:val="24"/>
+                <w:szCs w:val="24"/>
+              </w:rPr>
+            </w:pPr>
+            <w:r>
+              <w:rPr>
+                <w:rFonts w:ascii="Times New Roman" w:hAnsi="Times New Roman" w:cs="Times New Roman"/>
+                <w:sz w:val="24"/>
+                <w:szCs w:val="24"/>
+              </w:rPr>
+              <w:t>Positive recall is weaker; more positives are missed.</w:t>
+            </w:r>
+          </w:p>
+        </w:tc>
+      </w:tr>
+      <w:tr>
+        <w:trPr>
+          <w:trHeight w:val="350"/>
+          <w:jc w:val="center"/>
+        </w:trPr>
+        <w:tc>
+          <w:tcPr>
+            <w:tcW w:w="1375" w:type="dxa"/>
+            <w:vAlign w:val="center"/>
+          </w:tcPr>
+          <w:p>
+            <w:pPr>
+              <w:rPr>
+                <w:rFonts w:ascii="Times New Roman" w:hAnsi="Times New Roman" w:cs="Times New Roman"/>
+                <w:b/>
+                <w:bCs/>
+                <w:sz w:val="24"/>
+                <w:szCs w:val="24"/>
+              </w:rPr>
+            </w:pPr>
+            <w:r>
+              <w:rPr>
+                <w:rFonts w:ascii="Times New Roman" w:hAnsi="Times New Roman" w:cs="Times New Roman"/>
+                <w:b/>
+                <w:bCs/>
+                <w:sz w:val="24"/>
+                <w:szCs w:val="24"/>
+              </w:rPr>
+              <w:t>F1-score</w:t>
+            </w:r>
+          </w:p>
+        </w:tc>
+        <w:tc>
+          <w:tcPr>
+            <w:tcW w:w="1492" w:type="dxa"/>
+            <w:vAlign w:val="center"/>
+          </w:tcPr>
+          <w:p>
+            <w:pPr>
+              <w:jc w:val="center"/>
+              <w:rPr>
+                <w:rFonts w:ascii="Times New Roman" w:hAnsi="Times New Roman" w:cs="Times New Roman"/>
+                <w:sz w:val="24"/>
+                <w:szCs w:val="24"/>
+              </w:rPr>
+            </w:pPr>
+            <w:r>
+              <w:rPr>
+                <w:rFonts w:ascii="Times New Roman" w:hAnsi="Times New Roman" w:cs="Times New Roman"/>
+                <w:sz w:val="24"/>
+                <w:szCs w:val="24"/>
+              </w:rPr>
+              <w:t>0.735</w:t>
+            </w:r>
+          </w:p>
+        </w:tc>
+        <w:tc>
+          <w:tcPr>
+            <w:tcW w:w="1363" w:type="dxa"/>
+            <w:vAlign w:val="center"/>
+          </w:tcPr>
+          <w:p>
+            <w:pPr>
+              <w:jc w:val="center"/>
+              <w:rPr>
+                <w:rFonts w:ascii="Times New Roman" w:hAnsi="Times New Roman" w:cs="Times New Roman"/>
+                <w:sz w:val="24"/>
+                <w:szCs w:val="24"/>
+              </w:rPr>
+            </w:pPr>
+            <w:r>
+              <w:rPr>
+                <w:rFonts w:ascii="Times New Roman" w:hAnsi="Times New Roman" w:cs="Times New Roman"/>
+                <w:sz w:val="24"/>
+                <w:szCs w:val="24"/>
+              </w:rPr>
+              <w:t>0.690</w:t>
+            </w:r>
+          </w:p>
+        </w:tc>
+        <w:tc>
+          <w:tcPr>
+            <w:tcW w:w="5238" w:type="dxa"/>
+            <w:vAlign w:val="center"/>
+          </w:tcPr>
+          <w:p>
+            <w:pPr>
+              <w:rPr>
+                <w:rFonts w:ascii="Times New Roman" w:hAnsi="Times New Roman" w:cs="Times New Roman"/>
+                <w:sz w:val="24"/>
+                <w:szCs w:val="24"/>
+              </w:rPr>
+            </w:pPr>
+            <w:r>
+              <w:rPr>
+                <w:rFonts w:ascii="Times New Roman" w:hAnsi="Times New Roman" w:cs="Times New Roman"/>
+                <w:sz w:val="24"/>
+                <w:szCs w:val="24"/>
+              </w:rPr>
+              <w:t>Weighted F1 = 0.712</w:t>
+            </w:r>
+          </w:p>
+        </w:tc>
+      </w:tr>
+      <w:tr>
+        <w:trPr>
+          <w:trHeight w:val="350"/>
+          <w:jc w:val="center"/>
+        </w:trPr>
+        <w:tc>
+          <w:tcPr>
+            <w:tcW w:w="1375" w:type="dxa"/>
+            <w:vAlign w:val="center"/>
+          </w:tcPr>
+          <w:p>
+            <w:pPr>
+              <w:rPr>
+                <w:rFonts w:ascii="Times New Roman" w:hAnsi="Times New Roman" w:cs="Times New Roman"/>
+                <w:b/>
+                <w:bCs/>
+                <w:sz w:val="24"/>
+                <w:szCs w:val="24"/>
+              </w:rPr>
+            </w:pPr>
+            <w:r>
+              <w:rPr>
+                <w:rFonts w:ascii="Times New Roman" w:hAnsi="Times New Roman" w:cs="Times New Roman"/>
+                <w:b/>
+                <w:bCs/>
+                <w:sz w:val="24"/>
+                <w:szCs w:val="24"/>
+              </w:rPr>
+              <w:t>Support</w:t>
+            </w:r>
+          </w:p>
+        </w:tc>
+        <w:tc>
+          <w:tcPr>
+            <w:tcW w:w="1492" w:type="dxa"/>
+            <w:vAlign w:val="center"/>
+          </w:tcPr>
+          <w:p>
+            <w:pPr>
+              <w:jc w:val="center"/>
+              <w:rPr>
+                <w:rFonts w:ascii="Times New Roman" w:hAnsi="Times New Roman" w:cs="Times New Roman"/>
+                <w:sz w:val="24"/>
+                <w:szCs w:val="24"/>
+              </w:rPr>
+            </w:pPr>
+            <w:r>
+              <w:rPr>
+                <w:rFonts w:ascii="Times New Roman" w:hAnsi="Times New Roman" w:cs="Times New Roman"/>
+                <w:sz w:val="24"/>
+                <w:szCs w:val="24"/>
+              </w:rPr>
+              <w:t>21,707</w:t>
+            </w:r>
+          </w:p>
+        </w:tc>
+        <w:tc>
+          <w:tcPr>
+            <w:tcW w:w="1363" w:type="dxa"/>
+            <w:vAlign w:val="center"/>
+          </w:tcPr>
+          <w:p>
+            <w:pPr>
+              <w:jc w:val="center"/>
+              <w:rPr>
+                <w:rFonts w:ascii="Times New Roman" w:hAnsi="Times New Roman" w:cs="Times New Roman"/>
+                <w:sz w:val="24"/>
+                <w:szCs w:val="24"/>
+              </w:rPr>
+            </w:pPr>
+            <w:r>
+              <w:rPr>
+                <w:rFonts w:ascii="Times New Roman" w:hAnsi="Times New Roman" w:cs="Times New Roman"/>
+                <w:sz w:val="24"/>
+                <w:szCs w:val="24"/>
+              </w:rPr>
+              <w:t>21,950</w:t>
+            </w:r>
+          </w:p>
+        </w:tc>
+        <w:tc>
+          <w:tcPr>
+            <w:tcW w:w="5238" w:type="dxa"/>
+            <w:vAlign w:val="center"/>
+          </w:tcPr>
+          <w:p>
+            <w:pPr>
+              <w:rPr>
+                <w:rFonts w:ascii="Times New Roman" w:hAnsi="Times New Roman" w:cs="Times New Roman"/>
+                <w:sz w:val="24"/>
+                <w:szCs w:val="24"/>
+              </w:rPr>
+            </w:pPr>
+            <w:r>
+              <w:rPr>
+                <w:rFonts w:ascii="Times New Roman" w:hAnsi="Times New Roman" w:cs="Times New Roman"/>
+                <w:sz w:val="24"/>
+                <w:szCs w:val="24"/>
+              </w:rPr>
+              <w:t>Accuracy = 71.43% on 43,657 rows</w:t>
+            </w:r>
+          </w:p>
+        </w:tc>
+      </w:tr>
+      <w:tr>
+        <w:trPr>
+          <w:jc w:val="center"/>
+        </w:trPr>
+        <w:tc>
+          <w:tcPr>
+            <w:tcW w:w="1375" w:type="dxa"/>
+            <w:vAlign w:val="center"/>
+          </w:tcPr>
+          <w:p>
+            <w:pPr>
+              <w:rPr>
+                <w:rFonts w:ascii="Times New Roman" w:hAnsi="Times New Roman" w:cs="Times New Roman"/>
+                <w:b/>
+                <w:bCs/>
+                <w:sz w:val="24"/>
+                <w:szCs w:val="24"/>
+              </w:rPr>
+            </w:pPr>
+            <w:r>
+              <w:rPr>
+                <w:rFonts w:ascii="Times New Roman" w:hAnsi="Times New Roman" w:cs="Times New Roman"/>
+                <w:b/>
+                <w:bCs/>
+                <w:sz w:val="24"/>
+                <w:szCs w:val="24"/>
+              </w:rPr>
+              <w:t>Confusion</w:t>
+            </w:r>
+            <w:r>
+              <w:rPr>
+                <w:rFonts w:ascii="Times New Roman" w:hAnsi="Times New Roman" w:cs="Times New Roman"/>
+                <w:b/>
+                <w:bCs/>
+                <w:sz w:val="24"/>
+                <w:szCs w:val="24"/>
+              </w:rPr>
+              <w:t xml:space="preserve"> </w:t>
+            </w:r>
+            <w:r>
+              <w:rPr>
+                <w:rFonts w:ascii="Times New Roman" w:hAnsi="Times New Roman" w:cs="Times New Roman"/>
+                <w:b/>
+                <w:bCs/>
+                <w:sz w:val="24"/>
+                <w:szCs w:val="24"/>
+              </w:rPr>
+              <w:t>matrix</w:t>
+            </w:r>
+          </w:p>
+        </w:tc>
+        <w:tc>
+          <w:tcPr>
+            <w:tcW w:w="1492" w:type="dxa"/>
+            <w:vAlign w:val="center"/>
+          </w:tcPr>
+          <w:p>
+            <w:pPr>
+              <w:jc w:val="center"/>
+              <w:rPr>
+                <w:rFonts w:ascii="Times New Roman" w:hAnsi="Times New Roman" w:cs="Times New Roman"/>
+                <w:sz w:val="24"/>
+                <w:szCs w:val="24"/>
+              </w:rPr>
+            </w:pPr>
+            <w:r>
+              <w:rPr>
+                <w:rFonts w:ascii="Times New Roman" w:hAnsi="Times New Roman" w:cs="Times New Roman"/>
+                <w:sz w:val="24"/>
+                <w:szCs w:val="24"/>
+              </w:rPr>
+              <w:t>TN 17,287 / FP 4,420</w:t>
+            </w:r>
+          </w:p>
+        </w:tc>
+        <w:tc>
+          <w:tcPr>
+            <w:tcW w:w="1363" w:type="dxa"/>
+            <w:vAlign w:val="center"/>
+          </w:tcPr>
+          <w:p>
+            <w:pPr>
+              <w:jc w:val="center"/>
+              <w:rPr>
+                <w:rFonts w:ascii="Times New Roman" w:hAnsi="Times New Roman" w:cs="Times New Roman"/>
+                <w:sz w:val="24"/>
+                <w:szCs w:val="24"/>
+              </w:rPr>
+            </w:pPr>
+            <w:r>
+              <w:rPr>
+                <w:rFonts w:ascii="Times New Roman" w:hAnsi="Times New Roman" w:cs="Times New Roman"/>
+                <w:sz w:val="24"/>
+                <w:szCs w:val="24"/>
+              </w:rPr>
+              <w:t xml:space="preserve">FN 8,052 / </w:t>
+            </w:r>
+            <w:r>
+              <w:rPr>
+                <w:rFonts w:ascii="Times New Roman" w:hAnsi="Times New Roman" w:cs="Times New Roman"/>
+                <w:sz w:val="24"/>
+                <w:szCs w:val="24"/>
+              </w:rPr>
+              <w:br/>
+            </w:r>
+            <w:r>
+              <w:rPr>
+                <w:rFonts w:ascii="Times New Roman" w:hAnsi="Times New Roman" w:cs="Times New Roman"/>
+                <w:sz w:val="24"/>
+                <w:szCs w:val="24"/>
+              </w:rPr>
+              <w:t>TP 13,898</w:t>
+            </w:r>
+          </w:p>
+        </w:tc>
+        <w:tc>
+          <w:tcPr>
+            <w:tcW w:w="5238" w:type="dxa"/>
+            <w:vAlign w:val="center"/>
+          </w:tcPr>
+          <w:p>
+            <w:pPr>
+              <w:rPr>
+                <w:rFonts w:ascii="Times New Roman" w:hAnsi="Times New Roman" w:cs="Times New Roman"/>
+                <w:sz w:val="24"/>
+                <w:szCs w:val="24"/>
+              </w:rPr>
+            </w:pPr>
+            <w:r>
+              <w:rPr>
+                <w:rFonts w:ascii="Times New Roman" w:hAnsi="Times New Roman" w:cs="Times New Roman"/>
+                <w:sz w:val="24"/>
+                <w:szCs w:val="24"/>
+              </w:rPr>
+              <w:t>Large FN count explains lower positive recall.</w:t>
+            </w:r>
+          </w:p>
+        </w:tc>
+      </w:tr>
+    </w:tbl>
     <w:p>
+      <w:pPr>
+        <w:spacing w:after="80" w:line="240" w:lineRule="auto"/>
+        <w:rPr>
+          <w:rFonts w:ascii="Times New Roman" w:hAnsi="Times New Roman" w:cs="Times New Roman"/>
+          <w:b/>
+          <w:sz w:val="28"/>
+          <w:szCs w:val="28"/>
+        </w:rPr>
+      </w:pPr>
       <w:r>
         <w:rPr>
+          <w:rFonts w:ascii="Times New Roman" w:hAnsi="Times New Roman" w:cs="Times New Roman"/>
           <w:b/>
+          <w:sz w:val="24"/>
+          <w:szCs w:val="24"/>
         </w:rPr>
-        <w:t xml:space="preserve">Symptom: </w:t>
+        <w:br/>
       </w:r>
       <w:r>
-        <w:t>Streaming micro-batches into Delta tables produce many small files (often &lt; 10 MB). DESCRIBE DETAIL workspace.default.tweets_silver shows numFiles in the hundreds with an average size well below the 128 MB target. Downstream, the Aggregation stage has to open and plan all of them, inflating driver metadata work and per-task overhead. Additionally, the dashboard queries filter and group by mention and timestamp, but neither is a clustering key.</w:t>
-      </w:r>
-    </w:p>
-    <w:p>
-      <w:r>
         <w:rPr>
+          <w:rFonts w:ascii="Times New Roman" w:hAnsi="Times New Roman" w:cs="Times New Roman"/>
           <w:b/>
+          <w:sz w:val="28"/>
+          <w:szCs w:val="28"/>
         </w:rPr>
-        <w:t xml:space="preserve">Recommendations: </w:t>
+        <w:t>Conclusion</w:t>
       </w:r>
     </w:p>
     <w:p>
       <w:pPr>
-        <w:pStyle w:val="ListBullet"/>
-      </w:pPr>
-      <w:r>
-        <w:t>Enable auto-compaction on streaming writes: set delta.autoOptimize.optimizeWrite = true and delta.autoOptimize.autoCompact = true as table properties on tweets_silver and tweets_gold so each micro-batch produces well-sized files (~128 MB).</w:t>
-      </w:r>
-    </w:p>
-    <w:p>
-      <w:pPr>
-        <w:pStyle w:val="ListBullet"/>
-      </w:pPr>
-      <w:r>
-        <w:t>After the daily job, run OPTIMIZE workspace.default.tweets_gold ZORDER BY (mention, timestamp). The materialized view groups by mention and the dashboard slices by time, so ZORDER on these two columns gives data-skipping benefits on both.</w:t>
-      </w:r>
-    </w:p>
-    <w:p>
-      <w:pPr>
-        <w:pStyle w:val="ListBullet"/>
-      </w:pPr>
-      <w:r>
-        <w:t>For tweets_bronze, schedule VACUUM workspace.default.tweets_bronze RETAIN 168 HOURS weekly to clear old files once data is promoted to Silver / Gold.</w:t>
-      </w:r>
-    </w:p>
-    <w:p>
-      <w:pPr>
-        <w:pStyle w:val="ListBullet"/>
-      </w:pPr>
-      <w:r>
-        <w:t>Use Liquid Clustering as a future-proof alternative to ZORDER: ALTER TABLE tweets_gold CLUSTER BY (mention) eliminates the need to re-run OPTIMIZE after every batch.</w:t>
-      </w:r>
-    </w:p>
-    <w:p>
-      <w:r>
+        <w:spacing w:before="40" w:after="0" w:line="221" w:lineRule="auto"/>
+        <w:ind w:firstLine="720"/>
         <w:rPr>
-          <w:b/>
+          <w:rFonts w:ascii="Times New Roman" w:hAnsi="Times New Roman" w:cs="Times New Roman"/>
+          <w:sz w:val="24"/>
+          <w:szCs w:val="24"/>
         </w:rPr>
-        <w:t xml:space="preserve">Expected impact: </w:t>
-      </w:r>
-      <w:r>
-        <w:t>File count drops by ~10–20× after compaction; aggregation scan time falls proportionally to the data-skipping ratio (typically 3–5× for highly-selective mention filters in the dashboard).</w:t>
-      </w:r>
-    </w:p>
-    <w:p>
-      <w:pPr>
-        <w:pStyle w:val="Heading2"/>
       </w:pPr>
       <w:r>
         <w:rPr>
-          <w:color w:val="1F3A5F"/>
+          <w:rFonts w:ascii="Times New Roman" w:hAnsi="Times New Roman" w:cs="Times New Roman"/>
+          <w:sz w:val="24"/>
+          <w:szCs w:val="24"/>
         </w:rPr>
-        <w:lastRenderedPageBreak/>
-        <w:t>4. Shuffle &amp; Spill – Partition Tuning for a 50K-Row Dataset</w:t>
+        <w:t>The pipeline is not constrained by shuffle or spill in the current 43K-row workload</w:t>
       </w:r>
-    </w:p>
-    <w:p>
       <w:r>
         <w:rPr>
-          <w:b/>
+          <w:rFonts w:ascii="Times New Roman" w:hAnsi="Times New Roman" w:cs="Times New Roman"/>
+          <w:sz w:val="24"/>
+          <w:szCs w:val="24"/>
         </w:rPr>
-        <w:t xml:space="preserve">Symptom: </w:t>
+        <w:t>. T</w:t>
       </w:r>
       <w:r>
-        <w:t>Default spark.sql.shuffle.partitions = 200 means our ~50K-row aggregation runs with 200 reducer tasks, most of them holding &lt; 1 MB. The Spark UI Tasks tab shows hundreds of sub-second tasks with task launch / scheduler overhead exceeding actual compute. Conversely, the Silver explode multiplies row counts and concentrates load on a few partitions, producing Shuffle Spill (Disk) when a few celebrity mentions overflow the in-memory shuffle buffer.</w:t>
+        <w:rPr>
+          <w:rFonts w:ascii="Times New Roman" w:hAnsi="Times New Roman" w:cs="Times New Roman"/>
+          <w:sz w:val="24"/>
+          <w:szCs w:val="24"/>
+        </w:rPr>
+        <w:t xml:space="preserve">he </w:t>
       </w:r>
-    </w:p>
-    <w:p>
       <w:r>
         <w:rPr>
-          <w:b/>
+          <w:rFonts w:ascii="Times New Roman" w:hAnsi="Times New Roman" w:cs="Times New Roman"/>
+          <w:sz w:val="24"/>
+          <w:szCs w:val="24"/>
         </w:rPr>
-        <w:t xml:space="preserve">Recommendations: </w:t>
+        <w:t>main</w:t>
       </w:r>
-    </w:p>
-    <w:p>
-      <w:pPr>
-        <w:pStyle w:val="ListBullet"/>
-      </w:pPr>
-      <w:r>
-        <w:t>Let AQE coalesce partitions automatically: enable spark.sql.adaptive.coalescePartitions.enabled = true and set spark.sql.adaptive.advisoryPartitionSizeInBytes = 64MB so the planner picks an appropriate post-shuffle partition count based on actual data size.</w:t>
-      </w:r>
-    </w:p>
-    <w:p>
-      <w:pPr>
-        <w:pStyle w:val="ListBullet"/>
-      </w:pPr>
-      <w:r>
-        <w:t>Repartition before the explode/UDF stages by a high-cardinality key .repartition(spark.sparkContext.defaultParallelism * 2, col("text")) so the regex UDF and ML inference parallelize evenly across executors.</w:t>
-      </w:r>
-    </w:p>
-    <w:p>
-      <w:pPr>
-        <w:pStyle w:val="ListBullet"/>
-      </w:pPr>
-      <w:r>
-        <w:t>Persist the silver DataFrame after the expensive UDF (.persist(StorageLevel.MEMORY_AND_DISK)) when both the gold inference and a sanity-check action consume it, avoiding recomputation of the regex pass.</w:t>
-      </w:r>
-    </w:p>
-    <w:p>
-      <w:pPr>
-        <w:pStyle w:val="ListBullet"/>
-      </w:pPr>
-      <w:r>
-        <w:t>If spill persists, raise spark.executor.memoryOverhead to 25% and spark.memory.fraction to 0.7 so more of the heap is available to shuffle buffers before falling over to disk.</w:t>
-      </w:r>
-    </w:p>
-    <w:p>
       <w:r>
         <w:rPr>
-          <w:b/>
+          <w:rFonts w:ascii="Times New Roman" w:hAnsi="Times New Roman" w:cs="Times New Roman"/>
+          <w:sz w:val="24"/>
+          <w:szCs w:val="24"/>
         </w:rPr>
-        <w:t xml:space="preserve">Expected impact: </w:t>
+        <w:t xml:space="preserve"> issue is Gold-layer ML inference. The most effective optimization plan is </w:t>
       </w:r>
       <w:r>
-        <w:t>Total task count for the aggregation drops from 200 to ~8–16; scheduler overhead is removed, and shuffle spill (disk) drops to zero on the heavy-hitter reducers after AQE skew handling kicks in.</w:t>
+        <w:rPr>
+          <w:rFonts w:ascii="Times New Roman" w:hAnsi="Times New Roman" w:cs="Times New Roman"/>
+          <w:sz w:val="24"/>
+          <w:szCs w:val="24"/>
+        </w:rPr>
+        <w:t>to</w:t>
       </w:r>
-    </w:p>
-    <w:p>
-      <w:pPr>
-        <w:pStyle w:val="Heading2"/>
-      </w:pPr>
       <w:r>
         <w:rPr>
-          <w:color w:val="1F3A5F"/>
+          <w:rFonts w:ascii="Times New Roman" w:hAnsi="Times New Roman" w:cs="Times New Roman"/>
+          <w:sz w:val="24"/>
+          <w:szCs w:val="24"/>
         </w:rPr>
-        <w:t>Summary of Expected Gains</w:t>
-      </w:r>
-    </w:p>
-    <w:p>
-      <w:r>
-        <w:t>Combining these four changes – native regex + Pandas UDFs, AQE skew handling and salting on mention, optimizeWrite + autoCompact + ZORDER(mention, timestamp), and AQE-driven shuffle partition coalescing – we expect the daily pipeline wall-clock to drop by roughly 50–70% on the current dataset and to scale much more gracefully as new tweets are added each day. The changes are also additive: each one targets a different stage of the medallion DAG (Silver UDF, Gold inference, Application aggregation, Delta sto</w:t>
+        <w:t xml:space="preserve"> </w:t>
       </w:r>
       <w:r>
-        <w:t>rage), so failures or bottlenecks introduced later are easier to diagnose because no single stage is doing disproportionate work.</w:t>
+        <w:rPr>
+          <w:rFonts w:ascii="Times New Roman" w:hAnsi="Times New Roman" w:cs="Times New Roman"/>
+          <w:sz w:val="24"/>
+          <w:szCs w:val="24"/>
+        </w:rPr>
+        <w:t xml:space="preserve">first </w:t>
+      </w:r>
+      <w:r>
+        <w:rPr>
+          <w:rFonts w:ascii="Times New Roman" w:hAnsi="Times New Roman" w:cs="Times New Roman"/>
+          <w:sz w:val="24"/>
+          <w:szCs w:val="24"/>
+        </w:rPr>
+        <w:t xml:space="preserve">batch/cache model inference, </w:t>
+      </w:r>
+      <w:r>
+        <w:rPr>
+          <w:rFonts w:ascii="Times New Roman" w:hAnsi="Times New Roman" w:cs="Times New Roman"/>
+          <w:sz w:val="24"/>
+          <w:szCs w:val="24"/>
+        </w:rPr>
+        <w:t>then</w:t>
+      </w:r>
+      <w:r>
+        <w:rPr>
+          <w:rFonts w:ascii="Times New Roman" w:hAnsi="Times New Roman" w:cs="Times New Roman"/>
+          <w:sz w:val="24"/>
+          <w:szCs w:val="24"/>
+        </w:rPr>
+        <w:t xml:space="preserve"> replace Silver Python regex UDFs with native Spark </w:t>
+      </w:r>
+      <w:r>
+        <w:rPr>
+          <w:rFonts w:ascii="Times New Roman" w:hAnsi="Times New Roman" w:cs="Times New Roman"/>
+          <w:sz w:val="24"/>
+          <w:szCs w:val="24"/>
+        </w:rPr>
+        <w:t>expressions and</w:t>
+      </w:r>
+      <w:r>
+        <w:rPr>
+          <w:rFonts w:ascii="Times New Roman" w:hAnsi="Times New Roman" w:cs="Times New Roman"/>
+          <w:sz w:val="24"/>
+          <w:szCs w:val="24"/>
+        </w:rPr>
+        <w:t xml:space="preserve"> </w:t>
+      </w:r>
+      <w:r>
+        <w:rPr>
+          <w:rFonts w:ascii="Times New Roman" w:hAnsi="Times New Roman" w:cs="Times New Roman"/>
+          <w:sz w:val="24"/>
+          <w:szCs w:val="24"/>
+        </w:rPr>
+        <w:t>finally</w:t>
+      </w:r>
+      <w:r>
+        <w:rPr>
+          <w:rFonts w:ascii="Times New Roman" w:hAnsi="Times New Roman" w:cs="Times New Roman"/>
+          <w:sz w:val="24"/>
+          <w:szCs w:val="24"/>
+        </w:rPr>
+        <w:t xml:space="preserve"> maintain Delta layout using compaction or clustering as daily files accumulate. Model accuracy is 71.43%, with stronger negative recall than positive recall, so model-quality improvements should focus on preprocessing and reducing false negatives rather than changing the aggregation logic.</w:t>
       </w:r>
     </w:p>
     <w:sectPr>
-      <w:footerReference w:type="default" r:id="rId8"/>
+      <w:footerReference w:type="default" r:id="rId11"/>
       <w:pgSz w:w="12240" w:h="15840"/>
-      <w:pgMar w:top="1008" w:right="1152" w:bottom="1008" w:left="1152" w:header="720" w:footer="720" w:gutter="0"/>
+      <w:pgMar w:top="1440" w:right="1440" w:bottom="1440" w:left="1440" w:header="720" w:footer="720" w:gutter="0"/>
       <w:cols w:space="720"/>
       <w:docGrid w:linePitch="360"/>
     </w:sectPr>
@@ -541,7 +3097,11 @@
 <w:ftr xmlns:wpc="http://schemas.microsoft.com/office/word/2010/wordprocessingCanvas" xmlns:cx="http://schemas.microsoft.com/office/drawing/2014/chartex" xmlns:cx1="http://schemas.microsoft.com/office/drawing/2015/9/8/chartex" xmlns:cx2="http://schemas.microsoft.com/office/drawing/2015/10/21/chartex" xmlns:cx3="http://schemas.microsoft.com/office/drawing/2016/5/9/chartex" xmlns:cx4="http://schemas.microsoft.com/office/drawing/2016/5/10/chartex" xmlns:cx5="http://schemas.microsoft.com/office/drawing/2016/5/11/chartex" xmlns:cx6="http://schemas.microsoft.com/office/drawing/2016/5/12/chartex" xmlns:cx7="http://schemas.microsoft.com/office/drawing/2016/5/13/chartex" xmlns:cx8="http://schemas.microsoft.com/office/drawing/2016/5/14/chartex" xmlns:mc="http://schemas.openxmlformats.org/markup-compatibility/2006" xmlns:aink="http://schemas.microsoft.com/office/drawing/2016/ink" xmlns:am3d="http://schemas.microsoft.com/office/drawing/2017/model3d" xmlns:o="urn:schemas-microsoft-com:office:office" xmlns:oel="http://schemas.microsoft.com/office/2019/extlst" xmlns:r="http://schemas.openxmlformats.org/officeDocument/2006/relationships" xmlns:m="http://schemas.openxmlformats.org/officeDocument/2006/math" xmlns:v="urn:schemas-microsoft-com:vml" xmlns:wp14="http://schemas.microsoft.com/office/word/2010/wordprocessingDrawing" xmlns:wp="http://schemas.openxmlformats.org/drawingml/2006/wordprocessingDrawing" xmlns:w10="urn:schemas-microsoft-com:office:word" xmlns:w="http://schemas.openxmlformats.org/wordprocessingml/2006/main" xmlns:w14="http://schemas.microsoft.com/office/word/2010/wordml" xmlns:w15="http://schemas.microsoft.com/office/word/2012/wordml" xmlns:w16cex="http://schemas.microsoft.com/office/word/2018/wordml/cex" xmlns:w16cid="http://schemas.microsoft.com/office/word/2016/wordml/cid" xmlns:w16="http://schemas.microsoft.com/office/word/2018/wordml" xmlns:w16du="http://schemas.microsoft.com/office/word/2023/wordml/word16du" xmlns:w16sdtdh="http://schemas.microsoft.com/office/word/2020/wordml/sdtdatahash" xmlns:w16sdtfl="http://schemas.microsoft.com/office/word/2024/wordml/sdtformatlock" xmlns:w16se="http://schemas.microsoft.com/office/word/2015/wordml/symex" xmlns:wpg="http://schemas.microsoft.com/office/word/2010/wordprocessingGroup" xmlns:wpi="http://schemas.microsoft.com/office/word/2010/wordprocessingInk" xmlns:wne="http://schemas.microsoft.com/office/word/2006/wordml" xmlns:wps="http://schemas.microsoft.com/office/word/2010/wordprocessingShape" mc:Ignorable="w14 w15 w16se w16cid w16 w16cex w16sdtdh w16sdtfl w16du wp14">
   <w:sdt>
     <w:sdtPr>
-      <w:id w:val="266819805"/>
+      <w:rPr>
+        <w:sz w:val="24"/>
+        <w:szCs w:val="24"/>
+      </w:rPr>
+      <w:id w:val="-2043356421"/>
       <w:docPartObj>
         <w:docPartGallery w:val="Page Numbers (Bottom of Page)"/>
         <w:docPartUnique/>
@@ -549,6 +3109,7 @@
     </w:sdtPr>
     <w:sdtEndPr>
       <w:rPr>
+        <w:rFonts w:ascii="Times New Roman" w:hAnsi="Times New Roman" w:cs="Times New Roman"/>
         <w:noProof/>
       </w:rPr>
     </w:sdtEndPr>
@@ -557,36 +3118,57 @@
         <w:pPr>
           <w:pStyle w:val="Footer"/>
           <w:jc w:val="center"/>
+          <w:rPr>
+            <w:rFonts w:ascii="Times New Roman" w:hAnsi="Times New Roman" w:cs="Times New Roman"/>
+            <w:sz w:val="24"/>
+            <w:szCs w:val="24"/>
+          </w:rPr>
         </w:pPr>
         <w:r>
+          <w:rPr>
+            <w:rFonts w:ascii="Times New Roman" w:hAnsi="Times New Roman" w:cs="Times New Roman"/>
+            <w:sz w:val="24"/>
+            <w:szCs w:val="24"/>
+          </w:rPr>
           <w:fldChar w:fldCharType="begin"/>
         </w:r>
         <w:r>
+          <w:rPr>
+            <w:rFonts w:ascii="Times New Roman" w:hAnsi="Times New Roman" w:cs="Times New Roman"/>
+            <w:sz w:val="24"/>
+            <w:szCs w:val="24"/>
+          </w:rPr>
           <w:instrText xml:space="preserve"> PAGE   \* MERGEFORMAT </w:instrText>
         </w:r>
         <w:r>
+          <w:rPr>
+            <w:rFonts w:ascii="Times New Roman" w:hAnsi="Times New Roman" w:cs="Times New Roman"/>
+            <w:sz w:val="24"/>
+            <w:szCs w:val="24"/>
+          </w:rPr>
           <w:fldChar w:fldCharType="separate"/>
         </w:r>
         <w:r>
           <w:rPr>
+            <w:rFonts w:ascii="Times New Roman" w:hAnsi="Times New Roman" w:cs="Times New Roman"/>
             <w:noProof/>
+            <w:sz w:val="24"/>
+            <w:szCs w:val="24"/>
           </w:rPr>
           <w:t>2</w:t>
         </w:r>
         <w:r>
           <w:rPr>
+            <w:rFonts w:ascii="Times New Roman" w:hAnsi="Times New Roman" w:cs="Times New Roman"/>
             <w:noProof/>
+            <w:sz w:val="24"/>
+            <w:szCs w:val="24"/>
           </w:rPr>
           <w:fldChar w:fldCharType="end"/>
         </w:r>
       </w:p>
     </w:sdtContent>
   </w:sdt>
-  <w:p>
-    <w:pPr>
-      <w:pStyle w:val="Footer"/>
-    </w:pPr>
-  </w:p>
 </w:ftr>
 </file>
 
@@ -788,31 +3370,31 @@
       </w:rPr>
     </w:lvl>
   </w:abstractNum>
-  <w:num w:numId="1" w16cid:durableId="591204425">
+  <w:num w:numId="1" w16cid:durableId="4943707">
     <w:abstractNumId w:val="8"/>
   </w:num>
-  <w:num w:numId="2" w16cid:durableId="685861288">
+  <w:num w:numId="2" w16cid:durableId="308822992">
     <w:abstractNumId w:val="6"/>
   </w:num>
-  <w:num w:numId="3" w16cid:durableId="79102486">
+  <w:num w:numId="3" w16cid:durableId="1251280903">
     <w:abstractNumId w:val="5"/>
   </w:num>
-  <w:num w:numId="4" w16cid:durableId="1781800486">
+  <w:num w:numId="4" w16cid:durableId="1266425317">
     <w:abstractNumId w:val="4"/>
   </w:num>
-  <w:num w:numId="5" w16cid:durableId="391272412">
+  <w:num w:numId="5" w16cid:durableId="272172755">
     <w:abstractNumId w:val="7"/>
   </w:num>
-  <w:num w:numId="6" w16cid:durableId="1242063438">
+  <w:num w:numId="6" w16cid:durableId="1529103773">
     <w:abstractNumId w:val="3"/>
   </w:num>
-  <w:num w:numId="7" w16cid:durableId="1027222288">
+  <w:num w:numId="7" w16cid:durableId="1226800162">
     <w:abstractNumId w:val="2"/>
   </w:num>
-  <w:num w:numId="8" w16cid:durableId="1423333755">
+  <w:num w:numId="8" w16cid:durableId="1145052937">
     <w:abstractNumId w:val="1"/>
   </w:num>
-  <w:num w:numId="9" w16cid:durableId="1985500208">
+  <w:num w:numId="9" w16cid:durableId="858078930">
     <w:abstractNumId w:val="0"/>
   </w:num>
 </w:numbering>
@@ -1208,9 +3790,12 @@
     <w:name w:val="Normal"/>
     <w:qFormat/>
     <w:rsid w:val="00FC693F"/>
+    <w:pPr>
+      <w:spacing w:after="20" w:line="228" w:lineRule="auto"/>
+    </w:pPr>
     <w:rPr>
-      <w:rFonts w:ascii="Calibri" w:hAnsi="Calibri"/>
-      <w:sz w:val="21"/>
+      <w:rFonts w:ascii="Arial" w:eastAsia="Arial" w:hAnsi="Arial"/>
+      <w:sz w:val="16"/>
     </w:rPr>
   </w:style>
   <w:style w:type="paragraph" w:styleId="Heading1">
@@ -1224,7 +3809,7 @@
     <w:pPr>
       <w:keepNext/>
       <w:keepLines/>
-      <w:spacing w:before="480" w:after="0"/>
+      <w:spacing w:before="40"/>
       <w:outlineLvl w:val="0"/>
     </w:pPr>
     <w:rPr>
@@ -1232,7 +3817,7 @@
       <w:b/>
       <w:bCs/>
       <w:color w:val="365F91" w:themeColor="accent1" w:themeShade="BF"/>
-      <w:sz w:val="28"/>
+      <w:sz w:val="21"/>
       <w:szCs w:val="28"/>
     </w:rPr>
   </w:style>
@@ -1248,7 +3833,7 @@
     <w:pPr>
       <w:keepNext/>
       <w:keepLines/>
-      <w:spacing w:before="200" w:after="0"/>
+      <w:spacing w:before="40"/>
       <w:outlineLvl w:val="1"/>
     </w:pPr>
     <w:rPr>
@@ -1256,7 +3841,7 @@
       <w:b/>
       <w:bCs/>
       <w:color w:val="4F81BD" w:themeColor="accent1"/>
-      <w:sz w:val="26"/>
+      <w:sz w:val="18"/>
       <w:szCs w:val="26"/>
     </w:rPr>
   </w:style>
@@ -1557,15 +4142,16 @@
       <w:pBdr>
         <w:bottom w:val="single" w:sz="8" w:space="4" w:color="4F81BD" w:themeColor="accent1"/>
       </w:pBdr>
-      <w:spacing w:after="300" w:line="240" w:lineRule="auto"/>
+      <w:spacing w:before="40" w:line="240" w:lineRule="auto"/>
       <w:contextualSpacing/>
     </w:pPr>
     <w:rPr>
       <w:rFonts w:asciiTheme="majorHAnsi" w:eastAsiaTheme="majorEastAsia" w:hAnsiTheme="majorHAnsi" w:cstheme="majorBidi"/>
+      <w:b/>
       <w:color w:val="17365D" w:themeColor="text2" w:themeShade="BF"/>
       <w:spacing w:val="5"/>
       <w:kern w:val="28"/>
-      <w:sz w:val="52"/>
+      <w:sz w:val="30"/>
       <w:szCs w:val="52"/>
     </w:rPr>
   </w:style>
@@ -1681,7 +4267,6 @@
       <w:spacing w:after="120"/>
     </w:pPr>
     <w:rPr>
-      <w:sz w:val="16"/>
       <w:szCs w:val="16"/>
     </w:rPr>
   </w:style>

</xml_diff>